<commit_message>
Worksheet 5: Finished in class and submitted
</commit_message>
<xml_diff>
--- a/In Class Worksheet/Worksheet5_Bayesian_2026.docx
+++ b/In Class Worksheet/Worksheet5_Bayesian_2026.docx
@@ -152,7 +152,25 @@
           <w:sz w:val="24"/>
           <w:szCs w:val="24"/>
         </w:rPr>
-        <w:t>This group exercise contains a number of questions that pert</w:t>
+        <w:t xml:space="preserve">This group exercise contains </w:t>
+      </w:r>
+      <w:proofErr w:type="gramStart"/>
+      <w:r>
+        <w:rPr>
+          <w:rFonts w:ascii="Arial" w:hAnsi="Arial" w:cs="Arial"/>
+          <w:sz w:val="24"/>
+          <w:szCs w:val="24"/>
+        </w:rPr>
+        <w:t>a number of</w:t>
+      </w:r>
+      <w:proofErr w:type="gramEnd"/>
+      <w:r>
+        <w:rPr>
+          <w:rFonts w:ascii="Arial" w:hAnsi="Arial" w:cs="Arial"/>
+          <w:sz w:val="24"/>
+          <w:szCs w:val="24"/>
+        </w:rPr>
+        <w:t xml:space="preserve"> questions that pert</w:t>
       </w:r>
       <w:r>
         <w:rPr>
@@ -200,7 +218,25 @@
           <w:sz w:val="24"/>
           <w:szCs w:val="24"/>
         </w:rPr>
-        <w:t>is on github in PSA project repo</w:t>
+        <w:t xml:space="preserve">is on </w:t>
+      </w:r>
+      <w:proofErr w:type="spellStart"/>
+      <w:r>
+        <w:rPr>
+          <w:rFonts w:ascii="Arial" w:hAnsi="Arial" w:cs="Arial"/>
+          <w:sz w:val="24"/>
+          <w:szCs w:val="24"/>
+        </w:rPr>
+        <w:t>github</w:t>
+      </w:r>
+      <w:proofErr w:type="spellEnd"/>
+      <w:r>
+        <w:rPr>
+          <w:rFonts w:ascii="Arial" w:hAnsi="Arial" w:cs="Arial"/>
+          <w:sz w:val="24"/>
+          <w:szCs w:val="24"/>
+        </w:rPr>
+        <w:t xml:space="preserve"> in PSA project repo</w:t>
       </w:r>
       <w:r>
         <w:rPr>
@@ -322,7 +358,25 @@
           <w:sz w:val="24"/>
           <w:szCs w:val="24"/>
         </w:rPr>
-        <w:t xml:space="preserve">PSA is a well-established screening test for prostate cancer.  A university medical center urology group was interested in the association between prostate-specific antigen (PSA) and a number of prognostic clinical measurements in men with advanced prostate cancer.  The data consist of 97 men who were about to undergo radical </w:t>
+        <w:t xml:space="preserve">PSA is a well-established screening test for prostate cancer.  A university medical center urology group was interested in the association between prostate-specific antigen (PSA) and </w:t>
+      </w:r>
+      <w:proofErr w:type="gramStart"/>
+      <w:r>
+        <w:rPr>
+          <w:rFonts w:ascii="Arial" w:hAnsi="Arial" w:cs="Arial"/>
+          <w:sz w:val="24"/>
+          <w:szCs w:val="24"/>
+        </w:rPr>
+        <w:t>a number of</w:t>
+      </w:r>
+      <w:proofErr w:type="gramEnd"/>
+      <w:r>
+        <w:rPr>
+          <w:rFonts w:ascii="Arial" w:hAnsi="Arial" w:cs="Arial"/>
+          <w:sz w:val="24"/>
+          <w:szCs w:val="24"/>
+        </w:rPr>
+        <w:t xml:space="preserve"> prognostic clinical measurements in men with advanced prostate cancer.  The data consist of 97 men who were about to undergo radical </w:t>
       </w:r>
       <w:r>
         <w:rPr>
@@ -1639,7 +1693,21 @@
               <w:rPr>
                 <w:rFonts w:ascii="Arial" w:hAnsi="Arial" w:cs="Arial"/>
               </w:rPr>
-              <w:t>1 ( 4.8)</w:t>
+              <w:t xml:space="preserve">1 </w:t>
+            </w:r>
+            <w:proofErr w:type="gramStart"/>
+            <w:r>
+              <w:rPr>
+                <w:rFonts w:ascii="Arial" w:hAnsi="Arial" w:cs="Arial"/>
+              </w:rPr>
+              <w:t>( 4.8</w:t>
+            </w:r>
+            <w:proofErr w:type="gramEnd"/>
+            <w:r>
+              <w:rPr>
+                <w:rFonts w:ascii="Arial" w:hAnsi="Arial" w:cs="Arial"/>
+              </w:rPr>
+              <w:t>)</w:t>
             </w:r>
           </w:p>
           <w:p>
@@ -1721,7 +1789,27 @@
           <w:sz w:val="24"/>
           <w:szCs w:val="24"/>
         </w:rPr>
-        <w:t>From the table the variables that are significant include: PSA, log(PSA)</w:t>
+        <w:t xml:space="preserve">From the table the variables that are significant include: PSA, </w:t>
+      </w:r>
+      <w:proofErr w:type="gramStart"/>
+      <w:r>
+        <w:rPr>
+          <w:rFonts w:ascii="Arial" w:hAnsi="Arial" w:cs="Arial"/>
+          <w:color w:val="4F81BD" w:themeColor="accent1"/>
+          <w:sz w:val="24"/>
+          <w:szCs w:val="24"/>
+        </w:rPr>
+        <w:t>log(</w:t>
+      </w:r>
+      <w:proofErr w:type="gramEnd"/>
+      <w:r>
+        <w:rPr>
+          <w:rFonts w:ascii="Arial" w:hAnsi="Arial" w:cs="Arial"/>
+          <w:color w:val="4F81BD" w:themeColor="accent1"/>
+          <w:sz w:val="24"/>
+          <w:szCs w:val="24"/>
+        </w:rPr>
+        <w:t>PSA)</w:t>
       </w:r>
       <w:r>
         <w:rPr>
@@ -2411,6 +2499,7 @@
                 <w:szCs w:val="24"/>
               </w:rPr>
             </w:pPr>
+            <w:proofErr w:type="spellStart"/>
             <w:r>
               <w:rPr>
                 <w:rFonts w:ascii="Helvetica Neue" w:eastAsia="Times New Roman" w:hAnsi="Helvetica Neue" w:cs="Times New Roman"/>
@@ -2422,6 +2511,7 @@
               </w:rPr>
               <w:t>cavol</w:t>
             </w:r>
+            <w:proofErr w:type="spellEnd"/>
           </w:p>
         </w:tc>
         <w:tc>
@@ -2671,6 +2761,7 @@
                 <w:szCs w:val="24"/>
               </w:rPr>
             </w:pPr>
+            <w:proofErr w:type="spellStart"/>
             <w:r>
               <w:rPr>
                 <w:rFonts w:ascii="Helvetica Neue" w:eastAsia="Times New Roman" w:hAnsi="Helvetica Neue" w:cs="Times New Roman"/>
@@ -2682,6 +2773,7 @@
               </w:rPr>
               <w:t>svi</w:t>
             </w:r>
+            <w:proofErr w:type="spellEnd"/>
           </w:p>
         </w:tc>
         <w:tc>
@@ -2904,6 +2996,7 @@
                 <w:szCs w:val="24"/>
               </w:rPr>
             </w:pPr>
+            <w:proofErr w:type="spellStart"/>
             <w:r>
               <w:rPr>
                 <w:rFonts w:ascii="Helvetica Neue" w:eastAsia="Times New Roman" w:hAnsi="Helvetica Neue" w:cs="Times New Roman"/>
@@ -2915,6 +3008,7 @@
               </w:rPr>
               <w:t>cavolsviint</w:t>
             </w:r>
+            <w:proofErr w:type="spellEnd"/>
           </w:p>
         </w:tc>
         <w:tc>
@@ -3916,6 +4010,7 @@
                 <w:szCs w:val="24"/>
               </w:rPr>
             </w:pPr>
+            <w:proofErr w:type="spellStart"/>
             <w:r>
               <w:rPr>
                 <w:rFonts w:ascii="Helvetica Neue" w:eastAsia="Times New Roman" w:hAnsi="Helvetica Neue" w:cs="Times New Roman"/>
@@ -3927,6 +4022,7 @@
               </w:rPr>
               <w:t>cavol</w:t>
             </w:r>
+            <w:proofErr w:type="spellEnd"/>
           </w:p>
         </w:tc>
         <w:tc>
@@ -4149,6 +4245,7 @@
                 <w:szCs w:val="24"/>
               </w:rPr>
             </w:pPr>
+            <w:proofErr w:type="spellStart"/>
             <w:r>
               <w:rPr>
                 <w:rFonts w:ascii="Helvetica Neue" w:eastAsia="Times New Roman" w:hAnsi="Helvetica Neue" w:cs="Times New Roman"/>
@@ -4160,6 +4257,7 @@
               </w:rPr>
               <w:t>svi</w:t>
             </w:r>
+            <w:proofErr w:type="spellEnd"/>
           </w:p>
         </w:tc>
         <w:tc>
@@ -5181,6 +5279,7 @@
                 <w:szCs w:val="24"/>
               </w:rPr>
             </w:pPr>
+            <w:proofErr w:type="spellStart"/>
             <w:r>
               <w:rPr>
                 <w:rFonts w:ascii="Helvetica Neue" w:eastAsia="Times New Roman" w:hAnsi="Helvetica Neue" w:cs="Times New Roman"/>
@@ -5192,6 +5291,7 @@
               </w:rPr>
               <w:t>wt</w:t>
             </w:r>
+            <w:proofErr w:type="spellEnd"/>
           </w:p>
         </w:tc>
         <w:tc>
@@ -5405,6 +5505,7 @@
                 <w:szCs w:val="24"/>
               </w:rPr>
             </w:pPr>
+            <w:proofErr w:type="spellStart"/>
             <w:r>
               <w:rPr>
                 <w:rFonts w:ascii="Helvetica Neue" w:eastAsia="Times New Roman" w:hAnsi="Helvetica Neue" w:cs="Times New Roman"/>
@@ -5416,6 +5517,7 @@
               </w:rPr>
               <w:t>svi</w:t>
             </w:r>
+            <w:proofErr w:type="spellEnd"/>
           </w:p>
         </w:tc>
         <w:tc>
@@ -5656,6 +5758,7 @@
                 <w:szCs w:val="24"/>
               </w:rPr>
             </w:pPr>
+            <w:proofErr w:type="spellStart"/>
             <w:r>
               <w:rPr>
                 <w:rFonts w:ascii="Helvetica Neue" w:eastAsia="Times New Roman" w:hAnsi="Helvetica Neue" w:cs="Times New Roman"/>
@@ -5667,6 +5770,7 @@
               </w:rPr>
               <w:t>wtsviint</w:t>
             </w:r>
+            <w:proofErr w:type="spellEnd"/>
           </w:p>
         </w:tc>
         <w:tc>
@@ -6634,6 +6738,7 @@
                 <w:szCs w:val="24"/>
               </w:rPr>
             </w:pPr>
+            <w:proofErr w:type="spellStart"/>
             <w:r>
               <w:rPr>
                 <w:rFonts w:ascii="Helvetica Neue" w:eastAsia="Times New Roman" w:hAnsi="Helvetica Neue" w:cs="Times New Roman"/>
@@ -6645,6 +6750,7 @@
               </w:rPr>
               <w:t>wt</w:t>
             </w:r>
+            <w:proofErr w:type="spellEnd"/>
           </w:p>
         </w:tc>
         <w:tc>
@@ -6840,6 +6946,7 @@
                 <w:szCs w:val="24"/>
               </w:rPr>
             </w:pPr>
+            <w:proofErr w:type="spellStart"/>
             <w:r>
               <w:rPr>
                 <w:rFonts w:ascii="Helvetica Neue" w:eastAsia="Times New Roman" w:hAnsi="Helvetica Neue" w:cs="Times New Roman"/>
@@ -6851,6 +6958,7 @@
               </w:rPr>
               <w:t>svi</w:t>
             </w:r>
+            <w:proofErr w:type="spellEnd"/>
           </w:p>
         </w:tc>
         <w:tc>
@@ -7570,15 +7678,7 @@
                 <w:sz w:val="24"/>
                 <w:szCs w:val="24"/>
               </w:rPr>
-              <w:t>N</w:t>
-            </w:r>
-            <w:r>
-              <w:rPr>
-                <w:rFonts w:ascii="Arial" w:hAnsi="Arial" w:cs="Arial"/>
-                <w:sz w:val="24"/>
-                <w:szCs w:val="24"/>
-              </w:rPr>
-              <w:t>eed to calculate</w:t>
+              <w:t>Need to calculate</w:t>
             </w:r>
           </w:p>
         </w:tc>
@@ -7845,15 +7945,7 @@
                 <w:sz w:val="24"/>
                 <w:szCs w:val="24"/>
               </w:rPr>
-              <w:t>N</w:t>
-            </w:r>
-            <w:r>
-              <w:rPr>
-                <w:rFonts w:ascii="Arial" w:hAnsi="Arial" w:cs="Arial"/>
-                <w:sz w:val="24"/>
-                <w:szCs w:val="24"/>
-              </w:rPr>
-              <w:t>eed to calculate</w:t>
+              <w:t>Need to calculate</w:t>
             </w:r>
           </w:p>
         </w:tc>
@@ -8129,144 +8221,138 @@
     </w:p>
     <w:p>
       <w:pPr>
-        <w:spacing w:after="0"/>
-        <w:rPr>
-          <w:rFonts w:ascii="Arial" w:hAnsi="Arial" w:cs="Arial"/>
-          <w:color w:val="4F81BD" w:themeColor="accent1"/>
-          <w:sz w:val="24"/>
-          <w:szCs w:val="24"/>
-        </w:rPr>
-      </w:pPr>
-    </w:p>
-    <w:p>
-      <w:pPr>
-        <w:spacing w:after="0"/>
-        <w:rPr>
-          <w:rFonts w:ascii="Arial" w:hAnsi="Arial" w:cs="Arial"/>
-          <w:sz w:val="24"/>
-          <w:szCs w:val="24"/>
-        </w:rPr>
-      </w:pPr>
-    </w:p>
-    <w:p>
-      <w:pPr>
-        <w:spacing w:after="0"/>
-        <w:rPr>
-          <w:rFonts w:ascii="Arial" w:hAnsi="Arial" w:cs="Arial"/>
-          <w:sz w:val="24"/>
-          <w:szCs w:val="24"/>
-        </w:rPr>
-      </w:pPr>
-    </w:p>
-    <w:p>
-      <w:pPr>
-        <w:spacing w:after="0"/>
-        <w:rPr>
-          <w:rFonts w:ascii="Arial" w:hAnsi="Arial" w:cs="Arial"/>
-          <w:sz w:val="24"/>
-          <w:szCs w:val="24"/>
-        </w:rPr>
-      </w:pPr>
-    </w:p>
-    <w:p>
-      <w:pPr>
-        <w:spacing w:after="0"/>
-        <w:rPr>
-          <w:rFonts w:ascii="Arial" w:hAnsi="Arial" w:cs="Arial"/>
-          <w:sz w:val="24"/>
-          <w:szCs w:val="24"/>
-        </w:rPr>
-      </w:pPr>
-    </w:p>
-    <w:p>
-      <w:pPr>
-        <w:spacing w:after="0"/>
-        <w:rPr>
-          <w:rFonts w:ascii="Arial" w:hAnsi="Arial" w:cs="Arial"/>
-          <w:sz w:val="24"/>
-          <w:szCs w:val="24"/>
-        </w:rPr>
-      </w:pPr>
-    </w:p>
-    <w:p>
-      <w:pPr>
-        <w:spacing w:after="0"/>
-        <w:rPr>
-          <w:rFonts w:ascii="Arial" w:hAnsi="Arial" w:cs="Arial"/>
-          <w:sz w:val="24"/>
-          <w:szCs w:val="24"/>
-        </w:rPr>
-      </w:pPr>
-    </w:p>
-    <w:p>
-      <w:pPr>
-        <w:spacing w:after="0"/>
-        <w:rPr>
-          <w:rFonts w:ascii="Arial" w:hAnsi="Arial" w:cs="Arial"/>
-          <w:sz w:val="24"/>
-          <w:szCs w:val="24"/>
-        </w:rPr>
-      </w:pPr>
-    </w:p>
-    <w:p>
-      <w:pPr>
-        <w:spacing w:after="0"/>
-        <w:rPr>
-          <w:rFonts w:ascii="Arial" w:hAnsi="Arial" w:cs="Arial"/>
-          <w:sz w:val="24"/>
-          <w:szCs w:val="24"/>
-        </w:rPr>
-      </w:pPr>
-    </w:p>
-    <w:p>
-      <w:pPr>
-        <w:spacing w:after="0"/>
-        <w:rPr>
-          <w:rFonts w:ascii="Arial" w:hAnsi="Arial" w:cs="Arial"/>
-          <w:sz w:val="24"/>
-          <w:szCs w:val="24"/>
-        </w:rPr>
-      </w:pPr>
-    </w:p>
-    <w:p>
-      <w:pPr>
-        <w:spacing w:after="0"/>
-        <w:rPr>
-          <w:rFonts w:ascii="Arial" w:hAnsi="Arial" w:cs="Arial"/>
-          <w:sz w:val="24"/>
-          <w:szCs w:val="24"/>
-        </w:rPr>
-      </w:pPr>
-    </w:p>
-    <w:p>
-      <w:pPr>
-        <w:spacing w:after="0"/>
-        <w:rPr>
-          <w:rFonts w:ascii="Arial" w:hAnsi="Arial" w:cs="Arial"/>
-          <w:sz w:val="24"/>
-          <w:szCs w:val="24"/>
-        </w:rPr>
-      </w:pPr>
-    </w:p>
-    <w:p>
-      <w:pPr>
-        <w:spacing w:after="0"/>
-        <w:rPr>
-          <w:rFonts w:ascii="Arial" w:hAnsi="Arial" w:cs="Arial"/>
-          <w:sz w:val="24"/>
-          <w:szCs w:val="24"/>
-        </w:rPr>
-      </w:pPr>
-    </w:p>
-    <w:p>
-      <w:pPr>
-        <w:spacing w:after="0"/>
-        <w:rPr>
-          <w:rFonts w:ascii="Arial" w:hAnsi="Arial" w:cs="Arial"/>
-          <w:sz w:val="24"/>
-          <w:szCs w:val="24"/>
-        </w:rPr>
-      </w:pPr>
+        <w:pStyle w:val="ListParagraph"/>
+        <w:numPr>
+          <w:ilvl w:val="0"/>
+          <w:numId w:val="8"/>
+        </w:numPr>
+        <w:spacing w:after="0"/>
+        <w:rPr>
+          <w:rFonts w:ascii="Arial" w:hAnsi="Arial" w:cs="Arial"/>
+          <w:color w:val="4F81BD" w:themeColor="accent1"/>
+          <w:sz w:val="24"/>
+          <w:szCs w:val="24"/>
+        </w:rPr>
+      </w:pPr>
+      <w:r>
+        <w:rPr>
+          <w:rFonts w:ascii="Arial" w:hAnsi="Arial" w:cs="Arial"/>
+          <w:color w:val="4F81BD" w:themeColor="accent1"/>
+          <w:sz w:val="24"/>
+          <w:szCs w:val="24"/>
+        </w:rPr>
+        <w:t xml:space="preserve">Among SVI=0: </w:t>
+      </w:r>
+      <w:proofErr w:type="spellStart"/>
+      <w:r>
+        <w:rPr>
+          <w:rFonts w:ascii="Arial" w:hAnsi="Arial" w:cs="Arial"/>
+          <w:color w:val="4F81BD" w:themeColor="accent1"/>
+          <w:sz w:val="24"/>
+          <w:szCs w:val="24"/>
+        </w:rPr>
+        <w:t>cavol</w:t>
+      </w:r>
+      <w:proofErr w:type="spellEnd"/>
+      <w:r>
+        <w:rPr>
+          <w:rFonts w:ascii="Arial" w:hAnsi="Arial" w:cs="Arial"/>
+          <w:color w:val="4F81BD" w:themeColor="accent1"/>
+          <w:sz w:val="24"/>
+          <w:szCs w:val="24"/>
+        </w:rPr>
+        <w:t xml:space="preserve"> coefficient = 0.102 (HPDI: 0.063, 0.140) clear positive association</w:t>
+      </w:r>
+    </w:p>
+    <w:p>
+      <w:pPr>
+        <w:pStyle w:val="ListParagraph"/>
+        <w:numPr>
+          <w:ilvl w:val="0"/>
+          <w:numId w:val="8"/>
+        </w:numPr>
+        <w:spacing w:after="0"/>
+        <w:rPr>
+          <w:rFonts w:ascii="Arial" w:hAnsi="Arial" w:cs="Arial"/>
+          <w:color w:val="4F81BD" w:themeColor="accent1"/>
+          <w:sz w:val="24"/>
+          <w:szCs w:val="24"/>
+        </w:rPr>
+      </w:pPr>
+      <w:r>
+        <w:rPr>
+          <w:rFonts w:ascii="Arial" w:hAnsi="Arial" w:cs="Arial"/>
+          <w:color w:val="4F81BD" w:themeColor="accent1"/>
+          <w:sz w:val="24"/>
+          <w:szCs w:val="24"/>
+        </w:rPr>
+        <w:t>Interaction term = -0.056 (HPDI: -0.108, -0.003</w:t>
+      </w:r>
+      <w:proofErr w:type="gramStart"/>
+      <w:r>
+        <w:rPr>
+          <w:rFonts w:ascii="Arial" w:hAnsi="Arial" w:cs="Arial"/>
+          <w:color w:val="4F81BD" w:themeColor="accent1"/>
+          <w:sz w:val="24"/>
+          <w:szCs w:val="24"/>
+        </w:rPr>
+        <w:t>)  HPDI</w:t>
+      </w:r>
+      <w:proofErr w:type="gramEnd"/>
+      <w:r>
+        <w:rPr>
+          <w:rFonts w:ascii="Arial" w:hAnsi="Arial" w:cs="Arial"/>
+          <w:color w:val="4F81BD" w:themeColor="accent1"/>
+          <w:sz w:val="24"/>
+          <w:szCs w:val="24"/>
+        </w:rPr>
+        <w:t xml:space="preserve"> just excludes zero, weak evidence of a difference</w:t>
+      </w:r>
+    </w:p>
+    <w:p>
+      <w:pPr>
+        <w:pStyle w:val="ListParagraph"/>
+        <w:numPr>
+          <w:ilvl w:val="0"/>
+          <w:numId w:val="8"/>
+        </w:numPr>
+        <w:spacing w:after="0"/>
+        <w:rPr>
+          <w:rFonts w:ascii="Arial" w:hAnsi="Arial" w:cs="Arial"/>
+          <w:color w:val="4F81BD" w:themeColor="accent1"/>
+          <w:sz w:val="24"/>
+          <w:szCs w:val="24"/>
+        </w:rPr>
+      </w:pPr>
+      <w:r>
+        <w:rPr>
+          <w:rFonts w:ascii="Arial" w:hAnsi="Arial" w:cs="Arial"/>
+          <w:color w:val="4F81BD" w:themeColor="accent1"/>
+          <w:sz w:val="24"/>
+          <w:szCs w:val="24"/>
+        </w:rPr>
+        <w:t xml:space="preserve">There is weak evidence of </w:t>
+      </w:r>
+      <w:proofErr w:type="gramStart"/>
+      <w:r>
+        <w:rPr>
+          <w:rFonts w:ascii="Arial" w:hAnsi="Arial" w:cs="Arial"/>
+          <w:color w:val="4F81BD" w:themeColor="accent1"/>
+          <w:sz w:val="24"/>
+          <w:szCs w:val="24"/>
+        </w:rPr>
+        <w:t>an interaction</w:t>
+      </w:r>
+      <w:proofErr w:type="gramEnd"/>
+      <w:r>
+        <w:rPr>
+          <w:rFonts w:ascii="Arial" w:hAnsi="Arial" w:cs="Arial"/>
+          <w:color w:val="4F81BD" w:themeColor="accent1"/>
+          <w:sz w:val="24"/>
+          <w:szCs w:val="24"/>
+        </w:rPr>
+        <w:t>. The association between cancer volume and log PSA is slightly weaker in men with SVI</w:t>
+      </w:r>
     </w:p>
     <w:p>
       <w:pPr>
@@ -8383,53 +8469,78 @@
     </w:p>
     <w:p>
       <w:pPr>
-        <w:spacing w:after="0"/>
-        <w:rPr>
-          <w:rFonts w:ascii="Arial" w:hAnsi="Arial" w:cs="Arial"/>
-          <w:sz w:val="24"/>
-          <w:szCs w:val="24"/>
-        </w:rPr>
-      </w:pPr>
-    </w:p>
-    <w:p>
-      <w:pPr>
-        <w:spacing w:after="0"/>
-        <w:rPr>
-          <w:rFonts w:ascii="Arial" w:hAnsi="Arial" w:cs="Arial"/>
-          <w:sz w:val="24"/>
-          <w:szCs w:val="24"/>
-        </w:rPr>
-      </w:pPr>
-    </w:p>
-    <w:p>
-      <w:pPr>
-        <w:spacing w:after="0"/>
-        <w:rPr>
-          <w:rFonts w:ascii="Arial" w:hAnsi="Arial" w:cs="Arial"/>
-          <w:sz w:val="24"/>
-          <w:szCs w:val="24"/>
-        </w:rPr>
-      </w:pPr>
-    </w:p>
-    <w:p>
-      <w:pPr>
-        <w:spacing w:after="0"/>
-        <w:rPr>
-          <w:rFonts w:ascii="Arial" w:hAnsi="Arial" w:cs="Arial"/>
-          <w:sz w:val="24"/>
-          <w:szCs w:val="24"/>
-        </w:rPr>
-      </w:pPr>
-    </w:p>
-    <w:p>
-      <w:pPr>
-        <w:spacing w:after="0"/>
-        <w:rPr>
-          <w:rFonts w:ascii="Arial" w:hAnsi="Arial" w:cs="Arial"/>
-          <w:sz w:val="24"/>
-          <w:szCs w:val="24"/>
-        </w:rPr>
-      </w:pPr>
+        <w:pStyle w:val="ListParagraph"/>
+        <w:numPr>
+          <w:ilvl w:val="0"/>
+          <w:numId w:val="8"/>
+        </w:numPr>
+        <w:spacing w:after="0"/>
+        <w:rPr>
+          <w:rFonts w:ascii="Arial" w:hAnsi="Arial" w:cs="Arial"/>
+          <w:color w:val="4F81BD" w:themeColor="accent1"/>
+          <w:sz w:val="24"/>
+          <w:szCs w:val="24"/>
+        </w:rPr>
+      </w:pPr>
+      <w:r>
+        <w:rPr>
+          <w:rFonts w:ascii="Arial" w:hAnsi="Arial" w:cs="Arial"/>
+          <w:color w:val="4F81BD" w:themeColor="accent1"/>
+          <w:sz w:val="24"/>
+          <w:szCs w:val="24"/>
+        </w:rPr>
+        <w:t>Among SVI=0: weight coefficient = 0.024 (HPDI: 0.014, 0.035) positive association</w:t>
+      </w:r>
+    </w:p>
+    <w:p>
+      <w:pPr>
+        <w:pStyle w:val="ListParagraph"/>
+        <w:numPr>
+          <w:ilvl w:val="0"/>
+          <w:numId w:val="8"/>
+        </w:numPr>
+        <w:spacing w:after="0"/>
+        <w:rPr>
+          <w:rFonts w:ascii="Arial" w:hAnsi="Arial" w:cs="Arial"/>
+          <w:color w:val="4F81BD" w:themeColor="accent1"/>
+          <w:sz w:val="24"/>
+          <w:szCs w:val="24"/>
+        </w:rPr>
+      </w:pPr>
+      <w:r>
+        <w:rPr>
+          <w:rFonts w:ascii="Arial" w:hAnsi="Arial" w:cs="Arial"/>
+          <w:color w:val="4F81BD" w:themeColor="accent1"/>
+          <w:sz w:val="24"/>
+          <w:szCs w:val="24"/>
+        </w:rPr>
+        <w:t>Interaction term = -0.023 (HPDI: -0.048, 0.0002) HPDI includes zero, no credible interaction</w:t>
+      </w:r>
+    </w:p>
+    <w:p>
+      <w:pPr>
+        <w:pStyle w:val="ListParagraph"/>
+        <w:numPr>
+          <w:ilvl w:val="0"/>
+          <w:numId w:val="8"/>
+        </w:numPr>
+        <w:spacing w:after="0"/>
+        <w:rPr>
+          <w:rFonts w:ascii="Arial" w:hAnsi="Arial" w:cs="Arial"/>
+          <w:color w:val="4F81BD" w:themeColor="accent1"/>
+          <w:sz w:val="24"/>
+          <w:szCs w:val="24"/>
+        </w:rPr>
+      </w:pPr>
+      <w:r>
+        <w:rPr>
+          <w:rFonts w:ascii="Arial" w:hAnsi="Arial" w:cs="Arial"/>
+          <w:color w:val="4F81BD" w:themeColor="accent1"/>
+          <w:sz w:val="24"/>
+          <w:szCs w:val="24"/>
+        </w:rPr>
+        <w:t>No meaningful evidence of an interaction. Weight and SVI appear to have independent additive effects on log PSA</w:t>
+      </w:r>
     </w:p>
     <w:p>
       <w:pPr>
@@ -8538,6 +8649,7 @@
           <w:sz w:val="24"/>
           <w:szCs w:val="24"/>
         </w:rPr>
+        <w:lastRenderedPageBreak/>
         <w:t>Part II: Interpreting the code for a Bayesian Analysis</w:t>
       </w:r>
     </w:p>
@@ -8969,7 +9081,6 @@
           <w:sz w:val="24"/>
           <w:szCs w:val="24"/>
         </w:rPr>
-        <w:lastRenderedPageBreak/>
         <w:t>What were the distributions of the priors for each variable?</w:t>
       </w:r>
     </w:p>
@@ -9113,7 +9224,25 @@
           <w:sz w:val="24"/>
           <w:szCs w:val="24"/>
         </w:rPr>
-        <w:t>stribution of the likelihood?</w:t>
+        <w:t xml:space="preserve">stribution of </w:t>
+      </w:r>
+      <w:proofErr w:type="gramStart"/>
+      <w:r>
+        <w:rPr>
+          <w:rFonts w:ascii="Arial" w:hAnsi="Arial" w:cs="Arial"/>
+          <w:sz w:val="24"/>
+          <w:szCs w:val="24"/>
+        </w:rPr>
+        <w:t>the likelihood</w:t>
+      </w:r>
+      <w:proofErr w:type="gramEnd"/>
+      <w:r>
+        <w:rPr>
+          <w:rFonts w:ascii="Arial" w:hAnsi="Arial" w:cs="Arial"/>
+          <w:sz w:val="24"/>
+          <w:szCs w:val="24"/>
+        </w:rPr>
+        <w:t>?</w:t>
       </w:r>
     </w:p>
     <w:p>
@@ -9347,7 +9476,25 @@
           <w:sz w:val="24"/>
           <w:szCs w:val="24"/>
         </w:rPr>
-        <w:t>What were the values in the prior (mean and variance)?  Describe this prior in a sentence or two (non-informative, vague, informative biased how, investigator informed, etc.).</w:t>
+        <w:t xml:space="preserve">What were the values in the prior (mean and variance)?  Describe this </w:t>
+      </w:r>
+      <w:proofErr w:type="gramStart"/>
+      <w:r>
+        <w:rPr>
+          <w:rFonts w:ascii="Arial" w:hAnsi="Arial" w:cs="Arial"/>
+          <w:sz w:val="24"/>
+          <w:szCs w:val="24"/>
+        </w:rPr>
+        <w:t>prior</w:t>
+      </w:r>
+      <w:proofErr w:type="gramEnd"/>
+      <w:r>
+        <w:rPr>
+          <w:rFonts w:ascii="Arial" w:hAnsi="Arial" w:cs="Arial"/>
+          <w:sz w:val="24"/>
+          <w:szCs w:val="24"/>
+        </w:rPr>
+        <w:t xml:space="preserve"> in a sentence or two (non-informative, vague, informative biased how, investigator informed, etc.).</w:t>
       </w:r>
     </w:p>
     <w:p>
@@ -9379,7 +9526,47 @@
           <w:sz w:val="24"/>
           <w:szCs w:val="24"/>
         </w:rPr>
-        <w:t>Intercept N(1, sqrt(1000))</w:t>
+        <w:t xml:space="preserve">Intercept </w:t>
+      </w:r>
+      <w:proofErr w:type="gramStart"/>
+      <w:r>
+        <w:rPr>
+          <w:rFonts w:ascii="Arial" w:hAnsi="Arial" w:cs="Arial"/>
+          <w:color w:val="4F81BD" w:themeColor="accent1"/>
+          <w:sz w:val="24"/>
+          <w:szCs w:val="24"/>
+        </w:rPr>
+        <w:t>N(</w:t>
+      </w:r>
+      <w:proofErr w:type="gramEnd"/>
+      <w:r>
+        <w:rPr>
+          <w:rFonts w:ascii="Arial" w:hAnsi="Arial" w:cs="Arial"/>
+          <w:color w:val="4F81BD" w:themeColor="accent1"/>
+          <w:sz w:val="24"/>
+          <w:szCs w:val="24"/>
+        </w:rPr>
+        <w:t xml:space="preserve">1, </w:t>
+      </w:r>
+      <w:proofErr w:type="gramStart"/>
+      <w:r>
+        <w:rPr>
+          <w:rFonts w:ascii="Arial" w:hAnsi="Arial" w:cs="Arial"/>
+          <w:color w:val="4F81BD" w:themeColor="accent1"/>
+          <w:sz w:val="24"/>
+          <w:szCs w:val="24"/>
+        </w:rPr>
+        <w:t>sqrt(</w:t>
+      </w:r>
+      <w:proofErr w:type="gramEnd"/>
+      <w:r>
+        <w:rPr>
+          <w:rFonts w:ascii="Arial" w:hAnsi="Arial" w:cs="Arial"/>
+          <w:color w:val="4F81BD" w:themeColor="accent1"/>
+          <w:sz w:val="24"/>
+          <w:szCs w:val="24"/>
+        </w:rPr>
+        <w:t>1000))</w:t>
       </w:r>
     </w:p>
     <w:p>
@@ -9400,7 +9587,47 @@
           <w:sz w:val="24"/>
           <w:szCs w:val="24"/>
         </w:rPr>
-        <w:t>Other regression parameters N(0, sqrt(1000))</w:t>
+        <w:t xml:space="preserve">Other regression parameters </w:t>
+      </w:r>
+      <w:proofErr w:type="gramStart"/>
+      <w:r>
+        <w:rPr>
+          <w:rFonts w:ascii="Arial" w:hAnsi="Arial" w:cs="Arial"/>
+          <w:color w:val="4F81BD" w:themeColor="accent1"/>
+          <w:sz w:val="24"/>
+          <w:szCs w:val="24"/>
+        </w:rPr>
+        <w:t>N(</w:t>
+      </w:r>
+      <w:proofErr w:type="gramEnd"/>
+      <w:r>
+        <w:rPr>
+          <w:rFonts w:ascii="Arial" w:hAnsi="Arial" w:cs="Arial"/>
+          <w:color w:val="4F81BD" w:themeColor="accent1"/>
+          <w:sz w:val="24"/>
+          <w:szCs w:val="24"/>
+        </w:rPr>
+        <w:t xml:space="preserve">0, </w:t>
+      </w:r>
+      <w:proofErr w:type="gramStart"/>
+      <w:r>
+        <w:rPr>
+          <w:rFonts w:ascii="Arial" w:hAnsi="Arial" w:cs="Arial"/>
+          <w:color w:val="4F81BD" w:themeColor="accent1"/>
+          <w:sz w:val="24"/>
+          <w:szCs w:val="24"/>
+        </w:rPr>
+        <w:t>sqrt(</w:t>
+      </w:r>
+      <w:proofErr w:type="gramEnd"/>
+      <w:r>
+        <w:rPr>
+          <w:rFonts w:ascii="Arial" w:hAnsi="Arial" w:cs="Arial"/>
+          <w:color w:val="4F81BD" w:themeColor="accent1"/>
+          <w:sz w:val="24"/>
+          <w:szCs w:val="24"/>
+        </w:rPr>
+        <w:t>1000))</w:t>
       </w:r>
     </w:p>
     <w:p>
@@ -9421,7 +9648,27 @@
           <w:sz w:val="24"/>
           <w:szCs w:val="24"/>
         </w:rPr>
-        <w:t>Sigma: Half Normal(SD=100)</w:t>
+        <w:t xml:space="preserve">Sigma: Half </w:t>
+      </w:r>
+      <w:proofErr w:type="gramStart"/>
+      <w:r>
+        <w:rPr>
+          <w:rFonts w:ascii="Arial" w:hAnsi="Arial" w:cs="Arial"/>
+          <w:color w:val="4F81BD" w:themeColor="accent1"/>
+          <w:sz w:val="24"/>
+          <w:szCs w:val="24"/>
+        </w:rPr>
+        <w:t>Normal(</w:t>
+      </w:r>
+      <w:proofErr w:type="gramEnd"/>
+      <w:r>
+        <w:rPr>
+          <w:rFonts w:ascii="Arial" w:hAnsi="Arial" w:cs="Arial"/>
+          <w:color w:val="4F81BD" w:themeColor="accent1"/>
+          <w:sz w:val="24"/>
+          <w:szCs w:val="24"/>
+        </w:rPr>
+        <w:t>SD=100)</w:t>
       </w:r>
     </w:p>
     <w:p>
@@ -9611,7 +9858,43 @@
           <w:sz w:val="24"/>
           <w:szCs w:val="24"/>
         </w:rPr>
-        <w:t>mod &lt;- cmdstan_model('Code/STAN/linear_regression_half_normal.stan')</w:t>
+        <w:t xml:space="preserve">mod &lt;- </w:t>
+      </w:r>
+      <w:proofErr w:type="spellStart"/>
+      <w:r>
+        <w:rPr>
+          <w:rFonts w:ascii="Arial" w:hAnsi="Arial" w:cs="Arial"/>
+          <w:sz w:val="24"/>
+          <w:szCs w:val="24"/>
+        </w:rPr>
+        <w:t>cmdstan_model</w:t>
+      </w:r>
+      <w:proofErr w:type="spellEnd"/>
+      <w:r>
+        <w:rPr>
+          <w:rFonts w:ascii="Arial" w:hAnsi="Arial" w:cs="Arial"/>
+          <w:sz w:val="24"/>
+          <w:szCs w:val="24"/>
+        </w:rPr>
+        <w:t>('Code/STAN/</w:t>
+      </w:r>
+      <w:proofErr w:type="spellStart"/>
+      <w:r>
+        <w:rPr>
+          <w:rFonts w:ascii="Arial" w:hAnsi="Arial" w:cs="Arial"/>
+          <w:sz w:val="24"/>
+          <w:szCs w:val="24"/>
+        </w:rPr>
+        <w:t>linear_regression_half_normal.stan</w:t>
+      </w:r>
+      <w:proofErr w:type="spellEnd"/>
+      <w:r>
+        <w:rPr>
+          <w:rFonts w:ascii="Arial" w:hAnsi="Arial" w:cs="Arial"/>
+          <w:sz w:val="24"/>
+          <w:szCs w:val="24"/>
+        </w:rPr>
+        <w:t>')</w:t>
       </w:r>
     </w:p>
     <w:p>
@@ -9688,149 +9971,369 @@
           <w:sz w:val="24"/>
           <w:szCs w:val="24"/>
         </w:rPr>
-        <w:t xml:space="preserve">  int&lt;lower=0&gt; N;                  // number of observations</w:t>
-      </w:r>
-    </w:p>
-    <w:p>
-      <w:pPr>
-        <w:spacing w:after="0"/>
-        <w:rPr>
-          <w:rFonts w:ascii="Arial" w:hAnsi="Arial" w:cs="Arial"/>
-          <w:color w:val="4F81BD" w:themeColor="accent1"/>
-          <w:sz w:val="24"/>
-          <w:szCs w:val="24"/>
-        </w:rPr>
-      </w:pPr>
-      <w:r>
-        <w:rPr>
-          <w:rFonts w:ascii="Arial" w:hAnsi="Arial" w:cs="Arial"/>
-          <w:color w:val="4F81BD" w:themeColor="accent1"/>
-          <w:sz w:val="24"/>
-          <w:szCs w:val="24"/>
-        </w:rPr>
-        <w:t xml:space="preserve">  int&lt;lower=0&gt; P;                  // number of predictors including intercept</w:t>
-      </w:r>
-    </w:p>
-    <w:p>
-      <w:pPr>
-        <w:spacing w:after="0"/>
-        <w:rPr>
-          <w:rFonts w:ascii="Arial" w:hAnsi="Arial" w:cs="Arial"/>
-          <w:color w:val="4F81BD" w:themeColor="accent1"/>
-          <w:sz w:val="24"/>
-          <w:szCs w:val="24"/>
-        </w:rPr>
-      </w:pPr>
-      <w:r>
-        <w:rPr>
-          <w:rFonts w:ascii="Arial" w:hAnsi="Arial" w:cs="Arial"/>
-          <w:color w:val="4F81BD" w:themeColor="accent1"/>
-          <w:sz w:val="24"/>
-          <w:szCs w:val="24"/>
-        </w:rPr>
-        <w:t xml:space="preserve">  matrix[N, P] X;                  // design matrix (first column = intercept)</w:t>
-      </w:r>
-    </w:p>
-    <w:p>
-      <w:pPr>
-        <w:spacing w:after="0"/>
-        <w:rPr>
-          <w:rFonts w:ascii="Arial" w:hAnsi="Arial" w:cs="Arial"/>
-          <w:color w:val="4F81BD" w:themeColor="accent1"/>
-          <w:sz w:val="24"/>
-          <w:szCs w:val="24"/>
-        </w:rPr>
-      </w:pPr>
-      <w:r>
-        <w:rPr>
-          <w:rFonts w:ascii="Arial" w:hAnsi="Arial" w:cs="Arial"/>
-          <w:color w:val="4F81BD" w:themeColor="accent1"/>
-          <w:sz w:val="24"/>
-          <w:szCs w:val="24"/>
-        </w:rPr>
-        <w:t xml:space="preserve">  vector[N] y;                     // outcome</w:t>
-      </w:r>
-    </w:p>
-    <w:p>
-      <w:pPr>
-        <w:spacing w:after="0"/>
-        <w:rPr>
-          <w:rFonts w:ascii="Arial" w:hAnsi="Arial" w:cs="Arial"/>
-          <w:color w:val="4F81BD" w:themeColor="accent1"/>
-          <w:sz w:val="24"/>
-          <w:szCs w:val="24"/>
-        </w:rPr>
-      </w:pPr>
-    </w:p>
-    <w:p>
-      <w:pPr>
-        <w:spacing w:after="0"/>
-        <w:rPr>
-          <w:rFonts w:ascii="Arial" w:hAnsi="Arial" w:cs="Arial"/>
-          <w:color w:val="4F81BD" w:themeColor="accent1"/>
-          <w:sz w:val="24"/>
-          <w:szCs w:val="24"/>
-        </w:rPr>
-      </w:pPr>
-      <w:r>
-        <w:rPr>
-          <w:rFonts w:ascii="Arial" w:hAnsi="Arial" w:cs="Arial"/>
-          <w:color w:val="4F81BD" w:themeColor="accent1"/>
-          <w:sz w:val="24"/>
-          <w:szCs w:val="24"/>
-        </w:rPr>
-        <w:t xml:space="preserve">  vector[P] prior_mean;            // prior means for each beta</w:t>
-      </w:r>
-    </w:p>
-    <w:p>
-      <w:pPr>
-        <w:spacing w:after="0"/>
-        <w:rPr>
-          <w:rFonts w:ascii="Arial" w:hAnsi="Arial" w:cs="Arial"/>
-          <w:color w:val="4F81BD" w:themeColor="accent1"/>
-          <w:sz w:val="24"/>
-          <w:szCs w:val="24"/>
-        </w:rPr>
-      </w:pPr>
-      <w:r>
-        <w:rPr>
-          <w:rFonts w:ascii="Arial" w:hAnsi="Arial" w:cs="Arial"/>
-          <w:color w:val="4F81BD" w:themeColor="accent1"/>
-          <w:sz w:val="24"/>
-          <w:szCs w:val="24"/>
-        </w:rPr>
-        <w:t xml:space="preserve">  vector&lt;lower=0&gt;[P] prior_sd;     // prior SDs for each beta</w:t>
-      </w:r>
-    </w:p>
-    <w:p>
-      <w:pPr>
-        <w:spacing w:after="0"/>
-        <w:rPr>
-          <w:rFonts w:ascii="Arial" w:hAnsi="Arial" w:cs="Arial"/>
-          <w:color w:val="4F81BD" w:themeColor="accent1"/>
-          <w:sz w:val="24"/>
-          <w:szCs w:val="24"/>
-        </w:rPr>
-      </w:pPr>
-    </w:p>
-    <w:p>
-      <w:pPr>
-        <w:spacing w:after="0"/>
-        <w:rPr>
-          <w:rFonts w:ascii="Arial" w:hAnsi="Arial" w:cs="Arial"/>
-          <w:color w:val="4F81BD" w:themeColor="accent1"/>
-          <w:sz w:val="24"/>
-          <w:szCs w:val="24"/>
-        </w:rPr>
-      </w:pPr>
-      <w:r>
-        <w:rPr>
-          <w:rFonts w:ascii="Arial" w:hAnsi="Arial" w:cs="Arial"/>
-          <w:color w:val="4F81BD" w:themeColor="accent1"/>
-          <w:sz w:val="24"/>
-          <w:szCs w:val="24"/>
-        </w:rPr>
-        <w:t xml:space="preserve">  real&lt;lower=0&gt; sigma_prior_sd;    // SD for half-normal prior on sigma</w:t>
+        <w:t xml:space="preserve">  int&lt;lower=0&gt; </w:t>
+      </w:r>
+      <w:proofErr w:type="gramStart"/>
+      <w:r>
+        <w:rPr>
+          <w:rFonts w:ascii="Arial" w:hAnsi="Arial" w:cs="Arial"/>
+          <w:color w:val="4F81BD" w:themeColor="accent1"/>
+          <w:sz w:val="24"/>
+          <w:szCs w:val="24"/>
+        </w:rPr>
+        <w:t xml:space="preserve">N;   </w:t>
+      </w:r>
+      <w:proofErr w:type="gramEnd"/>
+      <w:r>
+        <w:rPr>
+          <w:rFonts w:ascii="Arial" w:hAnsi="Arial" w:cs="Arial"/>
+          <w:color w:val="4F81BD" w:themeColor="accent1"/>
+          <w:sz w:val="24"/>
+          <w:szCs w:val="24"/>
+        </w:rPr>
+        <w:t xml:space="preserve">               // number of observations</w:t>
+      </w:r>
+    </w:p>
+    <w:p>
+      <w:pPr>
+        <w:spacing w:after="0"/>
+        <w:rPr>
+          <w:rFonts w:ascii="Arial" w:hAnsi="Arial" w:cs="Arial"/>
+          <w:color w:val="4F81BD" w:themeColor="accent1"/>
+          <w:sz w:val="24"/>
+          <w:szCs w:val="24"/>
+        </w:rPr>
+      </w:pPr>
+      <w:r>
+        <w:rPr>
+          <w:rFonts w:ascii="Arial" w:hAnsi="Arial" w:cs="Arial"/>
+          <w:color w:val="4F81BD" w:themeColor="accent1"/>
+          <w:sz w:val="24"/>
+          <w:szCs w:val="24"/>
+        </w:rPr>
+        <w:t xml:space="preserve">  int&lt;lower=0&gt; </w:t>
+      </w:r>
+      <w:proofErr w:type="gramStart"/>
+      <w:r>
+        <w:rPr>
+          <w:rFonts w:ascii="Arial" w:hAnsi="Arial" w:cs="Arial"/>
+          <w:color w:val="4F81BD" w:themeColor="accent1"/>
+          <w:sz w:val="24"/>
+          <w:szCs w:val="24"/>
+        </w:rPr>
+        <w:t xml:space="preserve">P;   </w:t>
+      </w:r>
+      <w:proofErr w:type="gramEnd"/>
+      <w:r>
+        <w:rPr>
+          <w:rFonts w:ascii="Arial" w:hAnsi="Arial" w:cs="Arial"/>
+          <w:color w:val="4F81BD" w:themeColor="accent1"/>
+          <w:sz w:val="24"/>
+          <w:szCs w:val="24"/>
+        </w:rPr>
+        <w:t xml:space="preserve">               // number of predictors including intercept</w:t>
+      </w:r>
+    </w:p>
+    <w:p>
+      <w:pPr>
+        <w:spacing w:after="0"/>
+        <w:rPr>
+          <w:rFonts w:ascii="Arial" w:hAnsi="Arial" w:cs="Arial"/>
+          <w:color w:val="4F81BD" w:themeColor="accent1"/>
+          <w:sz w:val="24"/>
+          <w:szCs w:val="24"/>
+        </w:rPr>
+      </w:pPr>
+      <w:r>
+        <w:rPr>
+          <w:rFonts w:ascii="Arial" w:hAnsi="Arial" w:cs="Arial"/>
+          <w:color w:val="4F81BD" w:themeColor="accent1"/>
+          <w:sz w:val="24"/>
+          <w:szCs w:val="24"/>
+        </w:rPr>
+        <w:t xml:space="preserve">  </w:t>
+      </w:r>
+      <w:proofErr w:type="gramStart"/>
+      <w:r>
+        <w:rPr>
+          <w:rFonts w:ascii="Arial" w:hAnsi="Arial" w:cs="Arial"/>
+          <w:color w:val="4F81BD" w:themeColor="accent1"/>
+          <w:sz w:val="24"/>
+          <w:szCs w:val="24"/>
+        </w:rPr>
+        <w:t>matrix[</w:t>
+      </w:r>
+      <w:proofErr w:type="gramEnd"/>
+      <w:r>
+        <w:rPr>
+          <w:rFonts w:ascii="Arial" w:hAnsi="Arial" w:cs="Arial"/>
+          <w:color w:val="4F81BD" w:themeColor="accent1"/>
+          <w:sz w:val="24"/>
+          <w:szCs w:val="24"/>
+        </w:rPr>
+        <w:t xml:space="preserve">N, P] </w:t>
+      </w:r>
+      <w:proofErr w:type="gramStart"/>
+      <w:r>
+        <w:rPr>
+          <w:rFonts w:ascii="Arial" w:hAnsi="Arial" w:cs="Arial"/>
+          <w:color w:val="4F81BD" w:themeColor="accent1"/>
+          <w:sz w:val="24"/>
+          <w:szCs w:val="24"/>
+        </w:rPr>
+        <w:t xml:space="preserve">X;   </w:t>
+      </w:r>
+      <w:proofErr w:type="gramEnd"/>
+      <w:r>
+        <w:rPr>
+          <w:rFonts w:ascii="Arial" w:hAnsi="Arial" w:cs="Arial"/>
+          <w:color w:val="4F81BD" w:themeColor="accent1"/>
+          <w:sz w:val="24"/>
+          <w:szCs w:val="24"/>
+        </w:rPr>
+        <w:t xml:space="preserve">               // design matrix (first column = intercept)</w:t>
+      </w:r>
+    </w:p>
+    <w:p>
+      <w:pPr>
+        <w:spacing w:after="0"/>
+        <w:rPr>
+          <w:rFonts w:ascii="Arial" w:hAnsi="Arial" w:cs="Arial"/>
+          <w:color w:val="4F81BD" w:themeColor="accent1"/>
+          <w:sz w:val="24"/>
+          <w:szCs w:val="24"/>
+        </w:rPr>
+      </w:pPr>
+      <w:r>
+        <w:rPr>
+          <w:rFonts w:ascii="Arial" w:hAnsi="Arial" w:cs="Arial"/>
+          <w:color w:val="4F81BD" w:themeColor="accent1"/>
+          <w:sz w:val="24"/>
+          <w:szCs w:val="24"/>
+        </w:rPr>
+        <w:t xml:space="preserve">  vector[N] </w:t>
+      </w:r>
+      <w:proofErr w:type="gramStart"/>
+      <w:r>
+        <w:rPr>
+          <w:rFonts w:ascii="Arial" w:hAnsi="Arial" w:cs="Arial"/>
+          <w:color w:val="4F81BD" w:themeColor="accent1"/>
+          <w:sz w:val="24"/>
+          <w:szCs w:val="24"/>
+        </w:rPr>
+        <w:t xml:space="preserve">y;   </w:t>
+      </w:r>
+      <w:proofErr w:type="gramEnd"/>
+      <w:r>
+        <w:rPr>
+          <w:rFonts w:ascii="Arial" w:hAnsi="Arial" w:cs="Arial"/>
+          <w:color w:val="4F81BD" w:themeColor="accent1"/>
+          <w:sz w:val="24"/>
+          <w:szCs w:val="24"/>
+        </w:rPr>
+        <w:t xml:space="preserve">                  // outcome</w:t>
+      </w:r>
+    </w:p>
+    <w:p>
+      <w:pPr>
+        <w:spacing w:after="0"/>
+        <w:rPr>
+          <w:rFonts w:ascii="Arial" w:hAnsi="Arial" w:cs="Arial"/>
+          <w:color w:val="4F81BD" w:themeColor="accent1"/>
+          <w:sz w:val="24"/>
+          <w:szCs w:val="24"/>
+        </w:rPr>
+      </w:pPr>
+    </w:p>
+    <w:p>
+      <w:pPr>
+        <w:spacing w:after="0"/>
+        <w:rPr>
+          <w:rFonts w:ascii="Arial" w:hAnsi="Arial" w:cs="Arial"/>
+          <w:color w:val="4F81BD" w:themeColor="accent1"/>
+          <w:sz w:val="24"/>
+          <w:szCs w:val="24"/>
+        </w:rPr>
+      </w:pPr>
+      <w:r>
+        <w:rPr>
+          <w:rFonts w:ascii="Arial" w:hAnsi="Arial" w:cs="Arial"/>
+          <w:color w:val="4F81BD" w:themeColor="accent1"/>
+          <w:sz w:val="24"/>
+          <w:szCs w:val="24"/>
+        </w:rPr>
+        <w:t xml:space="preserve">  vector[P] </w:t>
+      </w:r>
+      <w:proofErr w:type="spellStart"/>
+      <w:r>
+        <w:rPr>
+          <w:rFonts w:ascii="Arial" w:hAnsi="Arial" w:cs="Arial"/>
+          <w:color w:val="4F81BD" w:themeColor="accent1"/>
+          <w:sz w:val="24"/>
+          <w:szCs w:val="24"/>
+        </w:rPr>
+        <w:t>prior_</w:t>
+      </w:r>
+      <w:proofErr w:type="gramStart"/>
+      <w:r>
+        <w:rPr>
+          <w:rFonts w:ascii="Arial" w:hAnsi="Arial" w:cs="Arial"/>
+          <w:color w:val="4F81BD" w:themeColor="accent1"/>
+          <w:sz w:val="24"/>
+          <w:szCs w:val="24"/>
+        </w:rPr>
+        <w:t>mean</w:t>
+      </w:r>
+      <w:proofErr w:type="spellEnd"/>
+      <w:r>
+        <w:rPr>
+          <w:rFonts w:ascii="Arial" w:hAnsi="Arial" w:cs="Arial"/>
+          <w:color w:val="4F81BD" w:themeColor="accent1"/>
+          <w:sz w:val="24"/>
+          <w:szCs w:val="24"/>
+        </w:rPr>
+        <w:t xml:space="preserve">;   </w:t>
+      </w:r>
+      <w:proofErr w:type="gramEnd"/>
+      <w:r>
+        <w:rPr>
+          <w:rFonts w:ascii="Arial" w:hAnsi="Arial" w:cs="Arial"/>
+          <w:color w:val="4F81BD" w:themeColor="accent1"/>
+          <w:sz w:val="24"/>
+          <w:szCs w:val="24"/>
+        </w:rPr>
+        <w:t xml:space="preserve">         // prior means for each beta</w:t>
+      </w:r>
+    </w:p>
+    <w:p>
+      <w:pPr>
+        <w:spacing w:after="0"/>
+        <w:rPr>
+          <w:rFonts w:ascii="Arial" w:hAnsi="Arial" w:cs="Arial"/>
+          <w:color w:val="4F81BD" w:themeColor="accent1"/>
+          <w:sz w:val="24"/>
+          <w:szCs w:val="24"/>
+        </w:rPr>
+      </w:pPr>
+      <w:r>
+        <w:rPr>
+          <w:rFonts w:ascii="Arial" w:hAnsi="Arial" w:cs="Arial"/>
+          <w:color w:val="4F81BD" w:themeColor="accent1"/>
+          <w:sz w:val="24"/>
+          <w:szCs w:val="24"/>
+        </w:rPr>
+        <w:t xml:space="preserve">  vector&lt;lower=0&gt;[P] </w:t>
+      </w:r>
+      <w:proofErr w:type="spellStart"/>
+      <w:r>
+        <w:rPr>
+          <w:rFonts w:ascii="Arial" w:hAnsi="Arial" w:cs="Arial"/>
+          <w:color w:val="4F81BD" w:themeColor="accent1"/>
+          <w:sz w:val="24"/>
+          <w:szCs w:val="24"/>
+        </w:rPr>
+        <w:t>prior_</w:t>
+      </w:r>
+      <w:proofErr w:type="gramStart"/>
+      <w:r>
+        <w:rPr>
+          <w:rFonts w:ascii="Arial" w:hAnsi="Arial" w:cs="Arial"/>
+          <w:color w:val="4F81BD" w:themeColor="accent1"/>
+          <w:sz w:val="24"/>
+          <w:szCs w:val="24"/>
+        </w:rPr>
+        <w:t>sd</w:t>
+      </w:r>
+      <w:proofErr w:type="spellEnd"/>
+      <w:r>
+        <w:rPr>
+          <w:rFonts w:ascii="Arial" w:hAnsi="Arial" w:cs="Arial"/>
+          <w:color w:val="4F81BD" w:themeColor="accent1"/>
+          <w:sz w:val="24"/>
+          <w:szCs w:val="24"/>
+        </w:rPr>
+        <w:t xml:space="preserve">;   </w:t>
+      </w:r>
+      <w:proofErr w:type="gramEnd"/>
+      <w:r>
+        <w:rPr>
+          <w:rFonts w:ascii="Arial" w:hAnsi="Arial" w:cs="Arial"/>
+          <w:color w:val="4F81BD" w:themeColor="accent1"/>
+          <w:sz w:val="24"/>
+          <w:szCs w:val="24"/>
+        </w:rPr>
+        <w:t xml:space="preserve">  // prior SDs for each beta</w:t>
+      </w:r>
+    </w:p>
+    <w:p>
+      <w:pPr>
+        <w:spacing w:after="0"/>
+        <w:rPr>
+          <w:rFonts w:ascii="Arial" w:hAnsi="Arial" w:cs="Arial"/>
+          <w:color w:val="4F81BD" w:themeColor="accent1"/>
+          <w:sz w:val="24"/>
+          <w:szCs w:val="24"/>
+        </w:rPr>
+      </w:pPr>
+    </w:p>
+    <w:p>
+      <w:pPr>
+        <w:spacing w:after="0"/>
+        <w:rPr>
+          <w:rFonts w:ascii="Arial" w:hAnsi="Arial" w:cs="Arial"/>
+          <w:color w:val="4F81BD" w:themeColor="accent1"/>
+          <w:sz w:val="24"/>
+          <w:szCs w:val="24"/>
+        </w:rPr>
+      </w:pPr>
+      <w:r>
+        <w:rPr>
+          <w:rFonts w:ascii="Arial" w:hAnsi="Arial" w:cs="Arial"/>
+          <w:color w:val="4F81BD" w:themeColor="accent1"/>
+          <w:sz w:val="24"/>
+          <w:szCs w:val="24"/>
+        </w:rPr>
+        <w:t xml:space="preserve">  real&lt;lower=0&gt; </w:t>
+      </w:r>
+      <w:proofErr w:type="spellStart"/>
+      <w:r>
+        <w:rPr>
+          <w:rFonts w:ascii="Arial" w:hAnsi="Arial" w:cs="Arial"/>
+          <w:color w:val="4F81BD" w:themeColor="accent1"/>
+          <w:sz w:val="24"/>
+          <w:szCs w:val="24"/>
+        </w:rPr>
+        <w:t>sigma_prior_</w:t>
+      </w:r>
+      <w:proofErr w:type="gramStart"/>
+      <w:r>
+        <w:rPr>
+          <w:rFonts w:ascii="Arial" w:hAnsi="Arial" w:cs="Arial"/>
+          <w:color w:val="4F81BD" w:themeColor="accent1"/>
+          <w:sz w:val="24"/>
+          <w:szCs w:val="24"/>
+        </w:rPr>
+        <w:t>sd</w:t>
+      </w:r>
+      <w:proofErr w:type="spellEnd"/>
+      <w:r>
+        <w:rPr>
+          <w:rFonts w:ascii="Arial" w:hAnsi="Arial" w:cs="Arial"/>
+          <w:color w:val="4F81BD" w:themeColor="accent1"/>
+          <w:sz w:val="24"/>
+          <w:szCs w:val="24"/>
+        </w:rPr>
+        <w:t xml:space="preserve">;   </w:t>
+      </w:r>
+      <w:proofErr w:type="gramEnd"/>
+      <w:r>
+        <w:rPr>
+          <w:rFonts w:ascii="Arial" w:hAnsi="Arial" w:cs="Arial"/>
+          <w:color w:val="4F81BD" w:themeColor="accent1"/>
+          <w:sz w:val="24"/>
+          <w:szCs w:val="24"/>
+        </w:rPr>
+        <w:t xml:space="preserve"> // SD for half-normal prior on sigma</w:t>
       </w:r>
     </w:p>
     <w:p>
@@ -9901,27 +10404,67 @@
           <w:sz w:val="24"/>
           <w:szCs w:val="24"/>
         </w:rPr>
-        <w:t xml:space="preserve">  vector[P] beta;                  // regression coefficients</w:t>
-      </w:r>
-    </w:p>
-    <w:p>
-      <w:pPr>
-        <w:spacing w:after="0"/>
-        <w:rPr>
-          <w:rFonts w:ascii="Arial" w:hAnsi="Arial" w:cs="Arial"/>
-          <w:color w:val="4F81BD" w:themeColor="accent1"/>
-          <w:sz w:val="24"/>
-          <w:szCs w:val="24"/>
-        </w:rPr>
-      </w:pPr>
-      <w:r>
-        <w:rPr>
-          <w:rFonts w:ascii="Arial" w:hAnsi="Arial" w:cs="Arial"/>
-          <w:color w:val="4F81BD" w:themeColor="accent1"/>
-          <w:sz w:val="24"/>
-          <w:szCs w:val="24"/>
-        </w:rPr>
-        <w:t xml:space="preserve">  real&lt;lower=0&gt; sigma;             // residual SD</w:t>
+        <w:t xml:space="preserve">  vector[P] </w:t>
+      </w:r>
+      <w:proofErr w:type="gramStart"/>
+      <w:r>
+        <w:rPr>
+          <w:rFonts w:ascii="Arial" w:hAnsi="Arial" w:cs="Arial"/>
+          <w:color w:val="4F81BD" w:themeColor="accent1"/>
+          <w:sz w:val="24"/>
+          <w:szCs w:val="24"/>
+        </w:rPr>
+        <w:t xml:space="preserve">beta;   </w:t>
+      </w:r>
+      <w:proofErr w:type="gramEnd"/>
+      <w:r>
+        <w:rPr>
+          <w:rFonts w:ascii="Arial" w:hAnsi="Arial" w:cs="Arial"/>
+          <w:color w:val="4F81BD" w:themeColor="accent1"/>
+          <w:sz w:val="24"/>
+          <w:szCs w:val="24"/>
+        </w:rPr>
+        <w:t xml:space="preserve">               // regression coefficients</w:t>
+      </w:r>
+    </w:p>
+    <w:p>
+      <w:pPr>
+        <w:spacing w:after="0"/>
+        <w:rPr>
+          <w:rFonts w:ascii="Arial" w:hAnsi="Arial" w:cs="Arial"/>
+          <w:color w:val="4F81BD" w:themeColor="accent1"/>
+          <w:sz w:val="24"/>
+          <w:szCs w:val="24"/>
+        </w:rPr>
+      </w:pPr>
+      <w:r>
+        <w:rPr>
+          <w:rFonts w:ascii="Arial" w:hAnsi="Arial" w:cs="Arial"/>
+          <w:color w:val="4F81BD" w:themeColor="accent1"/>
+          <w:sz w:val="24"/>
+          <w:szCs w:val="24"/>
+        </w:rPr>
+        <w:t xml:space="preserve">  real&lt;lower=0&gt; </w:t>
+      </w:r>
+      <w:proofErr w:type="gramStart"/>
+      <w:r>
+        <w:rPr>
+          <w:rFonts w:ascii="Arial" w:hAnsi="Arial" w:cs="Arial"/>
+          <w:color w:val="4F81BD" w:themeColor="accent1"/>
+          <w:sz w:val="24"/>
+          <w:szCs w:val="24"/>
+        </w:rPr>
+        <w:t xml:space="preserve">sigma;   </w:t>
+      </w:r>
+      <w:proofErr w:type="gramEnd"/>
+      <w:r>
+        <w:rPr>
+          <w:rFonts w:ascii="Arial" w:hAnsi="Arial" w:cs="Arial"/>
+          <w:color w:val="4F81BD" w:themeColor="accent1"/>
+          <w:sz w:val="24"/>
+          <w:szCs w:val="24"/>
+        </w:rPr>
+        <w:t xml:space="preserve">          // residual SD</w:t>
       </w:r>
     </w:p>
     <w:p>
@@ -10012,8 +10555,61 @@
           <w:sz w:val="24"/>
           <w:szCs w:val="24"/>
         </w:rPr>
-        <w:t xml:space="preserve">  beta ~ normal(prior_mean, prior_sd);</w:t>
-      </w:r>
+        <w:t xml:space="preserve">  beta ~ </w:t>
+      </w:r>
+      <w:proofErr w:type="gramStart"/>
+      <w:r>
+        <w:rPr>
+          <w:rFonts w:ascii="Arial" w:hAnsi="Arial" w:cs="Arial"/>
+          <w:color w:val="4F81BD" w:themeColor="accent1"/>
+          <w:sz w:val="24"/>
+          <w:szCs w:val="24"/>
+        </w:rPr>
+        <w:t>normal(</w:t>
+      </w:r>
+      <w:proofErr w:type="spellStart"/>
+      <w:proofErr w:type="gramEnd"/>
+      <w:r>
+        <w:rPr>
+          <w:rFonts w:ascii="Arial" w:hAnsi="Arial" w:cs="Arial"/>
+          <w:color w:val="4F81BD" w:themeColor="accent1"/>
+          <w:sz w:val="24"/>
+          <w:szCs w:val="24"/>
+        </w:rPr>
+        <w:t>prior_mean</w:t>
+      </w:r>
+      <w:proofErr w:type="spellEnd"/>
+      <w:r>
+        <w:rPr>
+          <w:rFonts w:ascii="Arial" w:hAnsi="Arial" w:cs="Arial"/>
+          <w:color w:val="4F81BD" w:themeColor="accent1"/>
+          <w:sz w:val="24"/>
+          <w:szCs w:val="24"/>
+        </w:rPr>
+        <w:t xml:space="preserve">, </w:t>
+      </w:r>
+      <w:proofErr w:type="spellStart"/>
+      <w:r>
+        <w:rPr>
+          <w:rFonts w:ascii="Arial" w:hAnsi="Arial" w:cs="Arial"/>
+          <w:color w:val="4F81BD" w:themeColor="accent1"/>
+          <w:sz w:val="24"/>
+          <w:szCs w:val="24"/>
+        </w:rPr>
+        <w:t>prior_sd</w:t>
+      </w:r>
+      <w:proofErr w:type="spellEnd"/>
+      <w:proofErr w:type="gramStart"/>
+      <w:r>
+        <w:rPr>
+          <w:rFonts w:ascii="Arial" w:hAnsi="Arial" w:cs="Arial"/>
+          <w:color w:val="4F81BD" w:themeColor="accent1"/>
+          <w:sz w:val="24"/>
+          <w:szCs w:val="24"/>
+        </w:rPr>
+        <w:t>);</w:t>
+      </w:r>
+      <w:proofErr w:type="gramEnd"/>
     </w:p>
     <w:p>
       <w:pPr>
@@ -10063,8 +10659,50 @@
           <w:sz w:val="24"/>
           <w:szCs w:val="24"/>
         </w:rPr>
-        <w:t xml:space="preserve">  sigma ~ normal(0, sigma_prior_sd);</w:t>
-      </w:r>
+        <w:t xml:space="preserve">  sigma ~ </w:t>
+      </w:r>
+      <w:proofErr w:type="gramStart"/>
+      <w:r>
+        <w:rPr>
+          <w:rFonts w:ascii="Arial" w:hAnsi="Arial" w:cs="Arial"/>
+          <w:color w:val="4F81BD" w:themeColor="accent1"/>
+          <w:sz w:val="24"/>
+          <w:szCs w:val="24"/>
+        </w:rPr>
+        <w:t>normal(</w:t>
+      </w:r>
+      <w:proofErr w:type="gramEnd"/>
+      <w:r>
+        <w:rPr>
+          <w:rFonts w:ascii="Arial" w:hAnsi="Arial" w:cs="Arial"/>
+          <w:color w:val="4F81BD" w:themeColor="accent1"/>
+          <w:sz w:val="24"/>
+          <w:szCs w:val="24"/>
+        </w:rPr>
+        <w:t xml:space="preserve">0, </w:t>
+      </w:r>
+      <w:proofErr w:type="spellStart"/>
+      <w:r>
+        <w:rPr>
+          <w:rFonts w:ascii="Arial" w:hAnsi="Arial" w:cs="Arial"/>
+          <w:color w:val="4F81BD" w:themeColor="accent1"/>
+          <w:sz w:val="24"/>
+          <w:szCs w:val="24"/>
+        </w:rPr>
+        <w:t>sigma_prior_sd</w:t>
+      </w:r>
+      <w:proofErr w:type="spellEnd"/>
+      <w:proofErr w:type="gramStart"/>
+      <w:r>
+        <w:rPr>
+          <w:rFonts w:ascii="Arial" w:hAnsi="Arial" w:cs="Arial"/>
+          <w:color w:val="4F81BD" w:themeColor="accent1"/>
+          <w:sz w:val="24"/>
+          <w:szCs w:val="24"/>
+        </w:rPr>
+        <w:t>);</w:t>
+      </w:r>
+      <w:proofErr w:type="gramEnd"/>
     </w:p>
     <w:p>
       <w:pPr>
@@ -10114,8 +10752,39 @@
           <w:sz w:val="24"/>
           <w:szCs w:val="24"/>
         </w:rPr>
-        <w:t xml:space="preserve">  y ~ normal(X * beta, sigma);</w:t>
-      </w:r>
+        <w:t xml:space="preserve">  y ~ </w:t>
+      </w:r>
+      <w:proofErr w:type="gramStart"/>
+      <w:r>
+        <w:rPr>
+          <w:rFonts w:ascii="Arial" w:hAnsi="Arial" w:cs="Arial"/>
+          <w:color w:val="4F81BD" w:themeColor="accent1"/>
+          <w:sz w:val="24"/>
+          <w:szCs w:val="24"/>
+        </w:rPr>
+        <w:t>normal(</w:t>
+      </w:r>
+      <w:proofErr w:type="gramEnd"/>
+      <w:r>
+        <w:rPr>
+          <w:rFonts w:ascii="Arial" w:hAnsi="Arial" w:cs="Arial"/>
+          <w:color w:val="4F81BD" w:themeColor="accent1"/>
+          <w:sz w:val="24"/>
+          <w:szCs w:val="24"/>
+        </w:rPr>
+        <w:t>X * beta, sigma</w:t>
+      </w:r>
+      <w:proofErr w:type="gramStart"/>
+      <w:r>
+        <w:rPr>
+          <w:rFonts w:ascii="Arial" w:hAnsi="Arial" w:cs="Arial"/>
+          <w:color w:val="4F81BD" w:themeColor="accent1"/>
+          <w:sz w:val="24"/>
+          <w:szCs w:val="24"/>
+        </w:rPr>
+        <w:t>);</w:t>
+      </w:r>
+      <w:proofErr w:type="gramEnd"/>
     </w:p>
     <w:p>
       <w:pPr>
@@ -10236,27 +10905,78 @@
           <w:sz w:val="24"/>
           <w:szCs w:val="24"/>
         </w:rPr>
-        <w:t xml:space="preserve">  vector[N] log_lik;</w:t>
-      </w:r>
-    </w:p>
-    <w:p>
-      <w:pPr>
-        <w:spacing w:after="0"/>
-        <w:rPr>
-          <w:rFonts w:ascii="Arial" w:hAnsi="Arial" w:cs="Arial"/>
-          <w:color w:val="4F81BD" w:themeColor="accent1"/>
-          <w:sz w:val="24"/>
-          <w:szCs w:val="24"/>
-        </w:rPr>
-      </w:pPr>
-      <w:r>
-        <w:rPr>
-          <w:rFonts w:ascii="Arial" w:hAnsi="Arial" w:cs="Arial"/>
-          <w:color w:val="4F81BD" w:themeColor="accent1"/>
-          <w:sz w:val="24"/>
-          <w:szCs w:val="24"/>
-        </w:rPr>
-        <w:t xml:space="preserve">  for (n in 1:N) {</w:t>
+        <w:t xml:space="preserve">  vector[N] </w:t>
+      </w:r>
+      <w:proofErr w:type="spellStart"/>
+      <w:r>
+        <w:rPr>
+          <w:rFonts w:ascii="Arial" w:hAnsi="Arial" w:cs="Arial"/>
+          <w:color w:val="4F81BD" w:themeColor="accent1"/>
+          <w:sz w:val="24"/>
+          <w:szCs w:val="24"/>
+        </w:rPr>
+        <w:t>log_</w:t>
+      </w:r>
+      <w:proofErr w:type="gramStart"/>
+      <w:r>
+        <w:rPr>
+          <w:rFonts w:ascii="Arial" w:hAnsi="Arial" w:cs="Arial"/>
+          <w:color w:val="4F81BD" w:themeColor="accent1"/>
+          <w:sz w:val="24"/>
+          <w:szCs w:val="24"/>
+        </w:rPr>
+        <w:t>lik</w:t>
+      </w:r>
+      <w:proofErr w:type="spellEnd"/>
+      <w:r>
+        <w:rPr>
+          <w:rFonts w:ascii="Arial" w:hAnsi="Arial" w:cs="Arial"/>
+          <w:color w:val="4F81BD" w:themeColor="accent1"/>
+          <w:sz w:val="24"/>
+          <w:szCs w:val="24"/>
+        </w:rPr>
+        <w:t>;</w:t>
+      </w:r>
+      <w:proofErr w:type="gramEnd"/>
+    </w:p>
+    <w:p>
+      <w:pPr>
+        <w:spacing w:after="0"/>
+        <w:rPr>
+          <w:rFonts w:ascii="Arial" w:hAnsi="Arial" w:cs="Arial"/>
+          <w:color w:val="4F81BD" w:themeColor="accent1"/>
+          <w:sz w:val="24"/>
+          <w:szCs w:val="24"/>
+        </w:rPr>
+      </w:pPr>
+      <w:r>
+        <w:rPr>
+          <w:rFonts w:ascii="Arial" w:hAnsi="Arial" w:cs="Arial"/>
+          <w:color w:val="4F81BD" w:themeColor="accent1"/>
+          <w:sz w:val="24"/>
+          <w:szCs w:val="24"/>
+        </w:rPr>
+        <w:t xml:space="preserve">  for (n in </w:t>
+      </w:r>
+      <w:proofErr w:type="gramStart"/>
+      <w:r>
+        <w:rPr>
+          <w:rFonts w:ascii="Arial" w:hAnsi="Arial" w:cs="Arial"/>
+          <w:color w:val="4F81BD" w:themeColor="accent1"/>
+          <w:sz w:val="24"/>
+          <w:szCs w:val="24"/>
+        </w:rPr>
+        <w:t>1:N</w:t>
+      </w:r>
+      <w:proofErr w:type="gramEnd"/>
+      <w:r>
+        <w:rPr>
+          <w:rFonts w:ascii="Arial" w:hAnsi="Arial" w:cs="Arial"/>
+          <w:color w:val="4F81BD" w:themeColor="accent1"/>
+          <w:sz w:val="24"/>
+          <w:szCs w:val="24"/>
+        </w:rPr>
+        <w:t>) {</w:t>
       </w:r>
     </w:p>
     <w:p>
@@ -10277,7 +10997,47 @@
           <w:szCs w:val="24"/>
         </w:rPr>
         <w:lastRenderedPageBreak/>
-        <w:t xml:space="preserve">    log_lik[n] = normal_lpdf(y[n] | X[n] * beta, sigma);}</w:t>
+        <w:t xml:space="preserve">    </w:t>
+      </w:r>
+      <w:proofErr w:type="spellStart"/>
+      <w:r>
+        <w:rPr>
+          <w:rFonts w:ascii="Arial" w:hAnsi="Arial" w:cs="Arial"/>
+          <w:color w:val="4F81BD" w:themeColor="accent1"/>
+          <w:sz w:val="24"/>
+          <w:szCs w:val="24"/>
+        </w:rPr>
+        <w:t>log_lik</w:t>
+      </w:r>
+      <w:proofErr w:type="spellEnd"/>
+      <w:r>
+        <w:rPr>
+          <w:rFonts w:ascii="Arial" w:hAnsi="Arial" w:cs="Arial"/>
+          <w:color w:val="4F81BD" w:themeColor="accent1"/>
+          <w:sz w:val="24"/>
+          <w:szCs w:val="24"/>
+        </w:rPr>
+        <w:t xml:space="preserve">[n] = </w:t>
+      </w:r>
+      <w:proofErr w:type="spellStart"/>
+      <w:r>
+        <w:rPr>
+          <w:rFonts w:ascii="Arial" w:hAnsi="Arial" w:cs="Arial"/>
+          <w:color w:val="4F81BD" w:themeColor="accent1"/>
+          <w:sz w:val="24"/>
+          <w:szCs w:val="24"/>
+        </w:rPr>
+        <w:t>normal_lpdf</w:t>
+      </w:r>
+      <w:proofErr w:type="spellEnd"/>
+      <w:r>
+        <w:rPr>
+          <w:rFonts w:ascii="Arial" w:hAnsi="Arial" w:cs="Arial"/>
+          <w:color w:val="4F81BD" w:themeColor="accent1"/>
+          <w:sz w:val="24"/>
+          <w:szCs w:val="24"/>
+        </w:rPr>
+        <w:t>(y[n] | X[n] * beta, sigma);}</w:t>
       </w:r>
     </w:p>
     <w:p>
@@ -10381,43 +11141,155 @@
           <w:sz w:val="24"/>
           <w:szCs w:val="24"/>
         </w:rPr>
-        <w:t># First fit full model for Cavol</w:t>
-      </w:r>
-    </w:p>
-    <w:p>
-      <w:pPr>
-        <w:spacing w:after="0"/>
-        <w:rPr>
-          <w:rFonts w:ascii="Arial" w:hAnsi="Arial" w:cs="Arial"/>
-          <w:sz w:val="24"/>
-          <w:szCs w:val="24"/>
-        </w:rPr>
-      </w:pPr>
-      <w:r>
-        <w:rPr>
-          <w:rFonts w:ascii="Arial" w:hAnsi="Arial" w:cs="Arial"/>
-          <w:sz w:val="24"/>
-          <w:szCs w:val="24"/>
-        </w:rPr>
-        <w:t>mod_name &lt;- 'cavol_svi_interaction'</w:t>
-      </w:r>
-    </w:p>
-    <w:p>
-      <w:pPr>
-        <w:spacing w:after="0"/>
-        <w:rPr>
-          <w:rFonts w:ascii="Arial" w:hAnsi="Arial" w:cs="Arial"/>
-          <w:sz w:val="24"/>
-          <w:szCs w:val="24"/>
-        </w:rPr>
-      </w:pPr>
-      <w:r>
-        <w:rPr>
-          <w:rFonts w:ascii="Arial" w:hAnsi="Arial" w:cs="Arial"/>
-          <w:sz w:val="24"/>
-          <w:szCs w:val="24"/>
-        </w:rPr>
-        <w:t xml:space="preserve">X &lt;- model.matrix(~ cavol + svi + cavolsviint, data = psaclean2) </w:t>
+        <w:t xml:space="preserve"># First fit full model for </w:t>
+      </w:r>
+      <w:proofErr w:type="spellStart"/>
+      <w:r>
+        <w:rPr>
+          <w:rFonts w:ascii="Arial" w:hAnsi="Arial" w:cs="Arial"/>
+          <w:sz w:val="24"/>
+          <w:szCs w:val="24"/>
+        </w:rPr>
+        <w:t>Cavol</w:t>
+      </w:r>
+      <w:proofErr w:type="spellEnd"/>
+    </w:p>
+    <w:p>
+      <w:pPr>
+        <w:spacing w:after="0"/>
+        <w:rPr>
+          <w:rFonts w:ascii="Arial" w:hAnsi="Arial" w:cs="Arial"/>
+          <w:sz w:val="24"/>
+          <w:szCs w:val="24"/>
+        </w:rPr>
+      </w:pPr>
+      <w:proofErr w:type="spellStart"/>
+      <w:r>
+        <w:rPr>
+          <w:rFonts w:ascii="Arial" w:hAnsi="Arial" w:cs="Arial"/>
+          <w:sz w:val="24"/>
+          <w:szCs w:val="24"/>
+        </w:rPr>
+        <w:t>mod_name</w:t>
+      </w:r>
+      <w:proofErr w:type="spellEnd"/>
+      <w:r>
+        <w:rPr>
+          <w:rFonts w:ascii="Arial" w:hAnsi="Arial" w:cs="Arial"/>
+          <w:sz w:val="24"/>
+          <w:szCs w:val="24"/>
+        </w:rPr>
+        <w:t xml:space="preserve"> &lt;- '</w:t>
+      </w:r>
+      <w:proofErr w:type="spellStart"/>
+      <w:r>
+        <w:rPr>
+          <w:rFonts w:ascii="Arial" w:hAnsi="Arial" w:cs="Arial"/>
+          <w:sz w:val="24"/>
+          <w:szCs w:val="24"/>
+        </w:rPr>
+        <w:t>cavol_svi_interaction</w:t>
+      </w:r>
+      <w:proofErr w:type="spellEnd"/>
+      <w:r>
+        <w:rPr>
+          <w:rFonts w:ascii="Arial" w:hAnsi="Arial" w:cs="Arial"/>
+          <w:sz w:val="24"/>
+          <w:szCs w:val="24"/>
+        </w:rPr>
+        <w:t>'</w:t>
+      </w:r>
+    </w:p>
+    <w:p>
+      <w:pPr>
+        <w:spacing w:after="0"/>
+        <w:rPr>
+          <w:rFonts w:ascii="Arial" w:hAnsi="Arial" w:cs="Arial"/>
+          <w:sz w:val="24"/>
+          <w:szCs w:val="24"/>
+        </w:rPr>
+      </w:pPr>
+      <w:r>
+        <w:rPr>
+          <w:rFonts w:ascii="Arial" w:hAnsi="Arial" w:cs="Arial"/>
+          <w:sz w:val="24"/>
+          <w:szCs w:val="24"/>
+        </w:rPr>
+        <w:t xml:space="preserve">X &lt;- </w:t>
+      </w:r>
+      <w:proofErr w:type="spellStart"/>
+      <w:proofErr w:type="gramStart"/>
+      <w:r>
+        <w:rPr>
+          <w:rFonts w:ascii="Arial" w:hAnsi="Arial" w:cs="Arial"/>
+          <w:sz w:val="24"/>
+          <w:szCs w:val="24"/>
+        </w:rPr>
+        <w:t>model.matrix</w:t>
+      </w:r>
+      <w:proofErr w:type="spellEnd"/>
+      <w:proofErr w:type="gramEnd"/>
+      <w:r>
+        <w:rPr>
+          <w:rFonts w:ascii="Arial" w:hAnsi="Arial" w:cs="Arial"/>
+          <w:sz w:val="24"/>
+          <w:szCs w:val="24"/>
+        </w:rPr>
+        <w:t xml:space="preserve">(~ </w:t>
+      </w:r>
+      <w:proofErr w:type="spellStart"/>
+      <w:r>
+        <w:rPr>
+          <w:rFonts w:ascii="Arial" w:hAnsi="Arial" w:cs="Arial"/>
+          <w:sz w:val="24"/>
+          <w:szCs w:val="24"/>
+        </w:rPr>
+        <w:t>cavol</w:t>
+      </w:r>
+      <w:proofErr w:type="spellEnd"/>
+      <w:r>
+        <w:rPr>
+          <w:rFonts w:ascii="Arial" w:hAnsi="Arial" w:cs="Arial"/>
+          <w:sz w:val="24"/>
+          <w:szCs w:val="24"/>
+        </w:rPr>
+        <w:t xml:space="preserve"> + </w:t>
+      </w:r>
+      <w:proofErr w:type="spellStart"/>
+      <w:r>
+        <w:rPr>
+          <w:rFonts w:ascii="Arial" w:hAnsi="Arial" w:cs="Arial"/>
+          <w:sz w:val="24"/>
+          <w:szCs w:val="24"/>
+        </w:rPr>
+        <w:t>svi</w:t>
+      </w:r>
+      <w:proofErr w:type="spellEnd"/>
+      <w:r>
+        <w:rPr>
+          <w:rFonts w:ascii="Arial" w:hAnsi="Arial" w:cs="Arial"/>
+          <w:sz w:val="24"/>
+          <w:szCs w:val="24"/>
+        </w:rPr>
+        <w:t xml:space="preserve"> + </w:t>
+      </w:r>
+      <w:proofErr w:type="spellStart"/>
+      <w:r>
+        <w:rPr>
+          <w:rFonts w:ascii="Arial" w:hAnsi="Arial" w:cs="Arial"/>
+          <w:sz w:val="24"/>
+          <w:szCs w:val="24"/>
+        </w:rPr>
+        <w:t>cavolsviint</w:t>
+      </w:r>
+      <w:proofErr w:type="spellEnd"/>
+      <w:r>
+        <w:rPr>
+          <w:rFonts w:ascii="Arial" w:hAnsi="Arial" w:cs="Arial"/>
+          <w:sz w:val="24"/>
+          <w:szCs w:val="24"/>
+        </w:rPr>
+        <w:t xml:space="preserve">, data = psaclean2) </w:t>
       </w:r>
     </w:p>
     <w:p>
@@ -10471,71 +11343,143 @@
           <w:sz w:val="24"/>
           <w:szCs w:val="24"/>
         </w:rPr>
-        <w:t>N &lt;- nrow(X)</w:t>
-      </w:r>
-    </w:p>
-    <w:p>
-      <w:pPr>
-        <w:spacing w:after="0"/>
-        <w:rPr>
-          <w:rFonts w:ascii="Arial" w:hAnsi="Arial" w:cs="Arial"/>
-          <w:sz w:val="24"/>
-          <w:szCs w:val="24"/>
-        </w:rPr>
-      </w:pPr>
-      <w:r>
-        <w:rPr>
-          <w:rFonts w:ascii="Arial" w:hAnsi="Arial" w:cs="Arial"/>
-          <w:sz w:val="24"/>
-          <w:szCs w:val="24"/>
-        </w:rPr>
-        <w:t>P &lt;- ncol(X)</w:t>
-      </w:r>
-    </w:p>
-    <w:p>
-      <w:pPr>
-        <w:spacing w:after="0"/>
-        <w:rPr>
-          <w:rFonts w:ascii="Arial" w:hAnsi="Arial" w:cs="Arial"/>
-          <w:sz w:val="24"/>
-          <w:szCs w:val="24"/>
-        </w:rPr>
-      </w:pPr>
-    </w:p>
-    <w:p>
-      <w:pPr>
-        <w:spacing w:after="0"/>
-        <w:rPr>
-          <w:rFonts w:ascii="Arial" w:hAnsi="Arial" w:cs="Arial"/>
-          <w:sz w:val="24"/>
-          <w:szCs w:val="24"/>
-        </w:rPr>
-      </w:pPr>
-      <w:r>
-        <w:rPr>
-          <w:rFonts w:ascii="Arial" w:hAnsi="Arial" w:cs="Arial"/>
-          <w:sz w:val="24"/>
-          <w:szCs w:val="24"/>
-        </w:rPr>
-        <w:t>## Hyperparameters for prior distributions. These change depending on your assumptions</w:t>
-      </w:r>
-    </w:p>
-    <w:p>
-      <w:pPr>
-        <w:spacing w:after="0"/>
-        <w:rPr>
-          <w:rFonts w:ascii="Arial" w:hAnsi="Arial" w:cs="Arial"/>
-          <w:sz w:val="24"/>
-          <w:szCs w:val="24"/>
-        </w:rPr>
-      </w:pPr>
-      <w:r>
-        <w:rPr>
-          <w:rFonts w:ascii="Arial" w:hAnsi="Arial" w:cs="Arial"/>
-          <w:sz w:val="24"/>
-          <w:szCs w:val="24"/>
-        </w:rPr>
-        <w:t>## For this problem the model error SD (sigma) is a half normal and the coefficients</w:t>
+        <w:t xml:space="preserve">N &lt;- </w:t>
+      </w:r>
+      <w:proofErr w:type="spellStart"/>
+      <w:r>
+        <w:rPr>
+          <w:rFonts w:ascii="Arial" w:hAnsi="Arial" w:cs="Arial"/>
+          <w:sz w:val="24"/>
+          <w:szCs w:val="24"/>
+        </w:rPr>
+        <w:t>nrow</w:t>
+      </w:r>
+      <w:proofErr w:type="spellEnd"/>
+      <w:r>
+        <w:rPr>
+          <w:rFonts w:ascii="Arial" w:hAnsi="Arial" w:cs="Arial"/>
+          <w:sz w:val="24"/>
+          <w:szCs w:val="24"/>
+        </w:rPr>
+        <w:t>(X)</w:t>
+      </w:r>
+    </w:p>
+    <w:p>
+      <w:pPr>
+        <w:spacing w:after="0"/>
+        <w:rPr>
+          <w:rFonts w:ascii="Arial" w:hAnsi="Arial" w:cs="Arial"/>
+          <w:sz w:val="24"/>
+          <w:szCs w:val="24"/>
+        </w:rPr>
+      </w:pPr>
+      <w:r>
+        <w:rPr>
+          <w:rFonts w:ascii="Arial" w:hAnsi="Arial" w:cs="Arial"/>
+          <w:sz w:val="24"/>
+          <w:szCs w:val="24"/>
+        </w:rPr>
+        <w:t xml:space="preserve">P &lt;- </w:t>
+      </w:r>
+      <w:proofErr w:type="spellStart"/>
+      <w:r>
+        <w:rPr>
+          <w:rFonts w:ascii="Arial" w:hAnsi="Arial" w:cs="Arial"/>
+          <w:sz w:val="24"/>
+          <w:szCs w:val="24"/>
+        </w:rPr>
+        <w:t>ncol</w:t>
+      </w:r>
+      <w:proofErr w:type="spellEnd"/>
+      <w:r>
+        <w:rPr>
+          <w:rFonts w:ascii="Arial" w:hAnsi="Arial" w:cs="Arial"/>
+          <w:sz w:val="24"/>
+          <w:szCs w:val="24"/>
+        </w:rPr>
+        <w:t>(X)</w:t>
+      </w:r>
+    </w:p>
+    <w:p>
+      <w:pPr>
+        <w:spacing w:after="0"/>
+        <w:rPr>
+          <w:rFonts w:ascii="Arial" w:hAnsi="Arial" w:cs="Arial"/>
+          <w:sz w:val="24"/>
+          <w:szCs w:val="24"/>
+        </w:rPr>
+      </w:pPr>
+    </w:p>
+    <w:p>
+      <w:pPr>
+        <w:spacing w:after="0"/>
+        <w:rPr>
+          <w:rFonts w:ascii="Arial" w:hAnsi="Arial" w:cs="Arial"/>
+          <w:sz w:val="24"/>
+          <w:szCs w:val="24"/>
+        </w:rPr>
+      </w:pPr>
+      <w:r>
+        <w:rPr>
+          <w:rFonts w:ascii="Arial" w:hAnsi="Arial" w:cs="Arial"/>
+          <w:sz w:val="24"/>
+          <w:szCs w:val="24"/>
+        </w:rPr>
+        <w:t xml:space="preserve">## Hyperparameters for prior distributions. </w:t>
+      </w:r>
+      <w:proofErr w:type="gramStart"/>
+      <w:r>
+        <w:rPr>
+          <w:rFonts w:ascii="Arial" w:hAnsi="Arial" w:cs="Arial"/>
+          <w:sz w:val="24"/>
+          <w:szCs w:val="24"/>
+        </w:rPr>
+        <w:t>These change</w:t>
+      </w:r>
+      <w:proofErr w:type="gramEnd"/>
+      <w:r>
+        <w:rPr>
+          <w:rFonts w:ascii="Arial" w:hAnsi="Arial" w:cs="Arial"/>
+          <w:sz w:val="24"/>
+          <w:szCs w:val="24"/>
+        </w:rPr>
+        <w:t xml:space="preserve"> depending on your assumptions</w:t>
+      </w:r>
+    </w:p>
+    <w:p>
+      <w:pPr>
+        <w:spacing w:after="0"/>
+        <w:rPr>
+          <w:rFonts w:ascii="Arial" w:hAnsi="Arial" w:cs="Arial"/>
+          <w:sz w:val="24"/>
+          <w:szCs w:val="24"/>
+        </w:rPr>
+      </w:pPr>
+      <w:r>
+        <w:rPr>
+          <w:rFonts w:ascii="Arial" w:hAnsi="Arial" w:cs="Arial"/>
+          <w:sz w:val="24"/>
+          <w:szCs w:val="24"/>
+        </w:rPr>
+        <w:t xml:space="preserve">## For this problem the model error SD (sigma) is </w:t>
+      </w:r>
+      <w:proofErr w:type="gramStart"/>
+      <w:r>
+        <w:rPr>
+          <w:rFonts w:ascii="Arial" w:hAnsi="Arial" w:cs="Arial"/>
+          <w:sz w:val="24"/>
+          <w:szCs w:val="24"/>
+        </w:rPr>
+        <w:t>a half</w:t>
+      </w:r>
+      <w:proofErr w:type="gramEnd"/>
+      <w:r>
+        <w:rPr>
+          <w:rFonts w:ascii="Arial" w:hAnsi="Arial" w:cs="Arial"/>
+          <w:sz w:val="24"/>
+          <w:szCs w:val="24"/>
+        </w:rPr>
+        <w:t xml:space="preserve"> normal and the coefficients</w:t>
       </w:r>
     </w:p>
     <w:p>
@@ -10599,90 +11543,246 @@
           <w:sz w:val="24"/>
           <w:szCs w:val="24"/>
         </w:rPr>
-        <w:t>m &lt;- c(1, rep(0, (P-1))) # mvnorm mean  (mean in the prior on the regression coefficients)</w:t>
-      </w:r>
-    </w:p>
-    <w:p>
-      <w:pPr>
-        <w:spacing w:after="0"/>
-        <w:rPr>
-          <w:rFonts w:ascii="Arial" w:hAnsi="Arial" w:cs="Arial"/>
-          <w:sz w:val="24"/>
-          <w:szCs w:val="24"/>
-        </w:rPr>
-      </w:pPr>
-      <w:r>
-        <w:rPr>
-          <w:rFonts w:ascii="Arial" w:hAnsi="Arial" w:cs="Arial"/>
-          <w:sz w:val="24"/>
-          <w:szCs w:val="24"/>
-        </w:rPr>
-        <w:t>s &lt;- rep(sqrt(1000),P) # SD in the prior on regression coefficients --&gt; variance 100^2</w:t>
-      </w:r>
-    </w:p>
-    <w:p>
-      <w:pPr>
-        <w:spacing w:after="0"/>
-        <w:rPr>
-          <w:rFonts w:ascii="Arial" w:hAnsi="Arial" w:cs="Arial"/>
-          <w:sz w:val="24"/>
-          <w:szCs w:val="24"/>
-        </w:rPr>
-      </w:pPr>
-      <w:r>
-        <w:rPr>
-          <w:rFonts w:ascii="Arial" w:hAnsi="Arial" w:cs="Arial"/>
-          <w:sz w:val="24"/>
-          <w:szCs w:val="24"/>
-        </w:rPr>
-        <w:t>sigma_sd &lt;- 100</w:t>
-      </w:r>
-    </w:p>
-    <w:p>
-      <w:pPr>
-        <w:spacing w:after="0"/>
-        <w:rPr>
-          <w:rFonts w:ascii="Arial" w:hAnsi="Arial" w:cs="Arial"/>
-          <w:sz w:val="24"/>
-          <w:szCs w:val="24"/>
-        </w:rPr>
-      </w:pPr>
-    </w:p>
-    <w:p>
-      <w:pPr>
-        <w:spacing w:after="0"/>
-        <w:rPr>
-          <w:rFonts w:ascii="Arial" w:hAnsi="Arial" w:cs="Arial"/>
-          <w:sz w:val="24"/>
-          <w:szCs w:val="24"/>
-        </w:rPr>
-      </w:pPr>
-      <w:r>
-        <w:rPr>
-          <w:rFonts w:ascii="Arial" w:hAnsi="Arial" w:cs="Arial"/>
-          <w:sz w:val="24"/>
-          <w:szCs w:val="24"/>
-        </w:rPr>
-        <w:t># create data list to pass to STAN</w:t>
-      </w:r>
-    </w:p>
-    <w:p>
-      <w:pPr>
-        <w:spacing w:after="0"/>
-        <w:rPr>
-          <w:rFonts w:ascii="Arial" w:hAnsi="Arial" w:cs="Arial"/>
-          <w:sz w:val="24"/>
-          <w:szCs w:val="24"/>
-        </w:rPr>
-      </w:pPr>
-      <w:r>
-        <w:rPr>
-          <w:rFonts w:ascii="Arial" w:hAnsi="Arial" w:cs="Arial"/>
-          <w:sz w:val="24"/>
-          <w:szCs w:val="24"/>
-        </w:rPr>
-        <w:t>data_list &lt;- list(</w:t>
-      </w:r>
+        <w:t xml:space="preserve">m &lt;- </w:t>
+      </w:r>
+      <w:proofErr w:type="gramStart"/>
+      <w:r>
+        <w:rPr>
+          <w:rFonts w:ascii="Arial" w:hAnsi="Arial" w:cs="Arial"/>
+          <w:sz w:val="24"/>
+          <w:szCs w:val="24"/>
+        </w:rPr>
+        <w:t>c(</w:t>
+      </w:r>
+      <w:proofErr w:type="gramEnd"/>
+      <w:r>
+        <w:rPr>
+          <w:rFonts w:ascii="Arial" w:hAnsi="Arial" w:cs="Arial"/>
+          <w:sz w:val="24"/>
+          <w:szCs w:val="24"/>
+        </w:rPr>
+        <w:t xml:space="preserve">1, </w:t>
+      </w:r>
+      <w:proofErr w:type="gramStart"/>
+      <w:r>
+        <w:rPr>
+          <w:rFonts w:ascii="Arial" w:hAnsi="Arial" w:cs="Arial"/>
+          <w:sz w:val="24"/>
+          <w:szCs w:val="24"/>
+        </w:rPr>
+        <w:t>rep(</w:t>
+      </w:r>
+      <w:proofErr w:type="gramEnd"/>
+      <w:r>
+        <w:rPr>
+          <w:rFonts w:ascii="Arial" w:hAnsi="Arial" w:cs="Arial"/>
+          <w:sz w:val="24"/>
+          <w:szCs w:val="24"/>
+        </w:rPr>
+        <w:t>0, (P-1)</w:t>
+      </w:r>
+      <w:proofErr w:type="gramStart"/>
+      <w:r>
+        <w:rPr>
+          <w:rFonts w:ascii="Arial" w:hAnsi="Arial" w:cs="Arial"/>
+          <w:sz w:val="24"/>
+          <w:szCs w:val="24"/>
+        </w:rPr>
+        <w:t>)) #</w:t>
+      </w:r>
+      <w:proofErr w:type="gramEnd"/>
+      <w:r>
+        <w:rPr>
+          <w:rFonts w:ascii="Arial" w:hAnsi="Arial" w:cs="Arial"/>
+          <w:sz w:val="24"/>
+          <w:szCs w:val="24"/>
+        </w:rPr>
+        <w:t xml:space="preserve"> </w:t>
+      </w:r>
+      <w:proofErr w:type="spellStart"/>
+      <w:r>
+        <w:rPr>
+          <w:rFonts w:ascii="Arial" w:hAnsi="Arial" w:cs="Arial"/>
+          <w:sz w:val="24"/>
+          <w:szCs w:val="24"/>
+        </w:rPr>
+        <w:t>mvnorm</w:t>
+      </w:r>
+      <w:proofErr w:type="spellEnd"/>
+      <w:r>
+        <w:rPr>
+          <w:rFonts w:ascii="Arial" w:hAnsi="Arial" w:cs="Arial"/>
+          <w:sz w:val="24"/>
+          <w:szCs w:val="24"/>
+        </w:rPr>
+        <w:t xml:space="preserve"> </w:t>
+      </w:r>
+      <w:proofErr w:type="gramStart"/>
+      <w:r>
+        <w:rPr>
+          <w:rFonts w:ascii="Arial" w:hAnsi="Arial" w:cs="Arial"/>
+          <w:sz w:val="24"/>
+          <w:szCs w:val="24"/>
+        </w:rPr>
+        <w:t>mean  (</w:t>
+      </w:r>
+      <w:proofErr w:type="gramEnd"/>
+      <w:r>
+        <w:rPr>
+          <w:rFonts w:ascii="Arial" w:hAnsi="Arial" w:cs="Arial"/>
+          <w:sz w:val="24"/>
+          <w:szCs w:val="24"/>
+        </w:rPr>
+        <w:t>mean in the prior on the regression coefficients)</w:t>
+      </w:r>
+    </w:p>
+    <w:p>
+      <w:pPr>
+        <w:spacing w:after="0"/>
+        <w:rPr>
+          <w:rFonts w:ascii="Arial" w:hAnsi="Arial" w:cs="Arial"/>
+          <w:sz w:val="24"/>
+          <w:szCs w:val="24"/>
+        </w:rPr>
+      </w:pPr>
+      <w:r>
+        <w:rPr>
+          <w:rFonts w:ascii="Arial" w:hAnsi="Arial" w:cs="Arial"/>
+          <w:sz w:val="24"/>
+          <w:szCs w:val="24"/>
+        </w:rPr>
+        <w:t>s &lt;- rep(sqrt(1000</w:t>
+      </w:r>
+      <w:proofErr w:type="gramStart"/>
+      <w:r>
+        <w:rPr>
+          <w:rFonts w:ascii="Arial" w:hAnsi="Arial" w:cs="Arial"/>
+          <w:sz w:val="24"/>
+          <w:szCs w:val="24"/>
+        </w:rPr>
+        <w:t>),P</w:t>
+      </w:r>
+      <w:proofErr w:type="gramEnd"/>
+      <w:r>
+        <w:rPr>
+          <w:rFonts w:ascii="Arial" w:hAnsi="Arial" w:cs="Arial"/>
+          <w:sz w:val="24"/>
+          <w:szCs w:val="24"/>
+        </w:rPr>
+        <w:t>) # SD in the prior on regression coefficients --&gt; variance 100^2</w:t>
+      </w:r>
+    </w:p>
+    <w:p>
+      <w:pPr>
+        <w:spacing w:after="0"/>
+        <w:rPr>
+          <w:rFonts w:ascii="Arial" w:hAnsi="Arial" w:cs="Arial"/>
+          <w:sz w:val="24"/>
+          <w:szCs w:val="24"/>
+        </w:rPr>
+      </w:pPr>
+      <w:proofErr w:type="spellStart"/>
+      <w:r>
+        <w:rPr>
+          <w:rFonts w:ascii="Arial" w:hAnsi="Arial" w:cs="Arial"/>
+          <w:sz w:val="24"/>
+          <w:szCs w:val="24"/>
+        </w:rPr>
+        <w:t>sigma_sd</w:t>
+      </w:r>
+      <w:proofErr w:type="spellEnd"/>
+      <w:r>
+        <w:rPr>
+          <w:rFonts w:ascii="Arial" w:hAnsi="Arial" w:cs="Arial"/>
+          <w:sz w:val="24"/>
+          <w:szCs w:val="24"/>
+        </w:rPr>
+        <w:t xml:space="preserve"> &lt;- 100</w:t>
+      </w:r>
+    </w:p>
+    <w:p>
+      <w:pPr>
+        <w:spacing w:after="0"/>
+        <w:rPr>
+          <w:rFonts w:ascii="Arial" w:hAnsi="Arial" w:cs="Arial"/>
+          <w:sz w:val="24"/>
+          <w:szCs w:val="24"/>
+        </w:rPr>
+      </w:pPr>
+    </w:p>
+    <w:p>
+      <w:pPr>
+        <w:spacing w:after="0"/>
+        <w:rPr>
+          <w:rFonts w:ascii="Arial" w:hAnsi="Arial" w:cs="Arial"/>
+          <w:sz w:val="24"/>
+          <w:szCs w:val="24"/>
+        </w:rPr>
+      </w:pPr>
+      <w:r>
+        <w:rPr>
+          <w:rFonts w:ascii="Arial" w:hAnsi="Arial" w:cs="Arial"/>
+          <w:sz w:val="24"/>
+          <w:szCs w:val="24"/>
+        </w:rPr>
+        <w:t xml:space="preserve"># </w:t>
+      </w:r>
+      <w:proofErr w:type="gramStart"/>
+      <w:r>
+        <w:rPr>
+          <w:rFonts w:ascii="Arial" w:hAnsi="Arial" w:cs="Arial"/>
+          <w:sz w:val="24"/>
+          <w:szCs w:val="24"/>
+        </w:rPr>
+        <w:t>create</w:t>
+      </w:r>
+      <w:proofErr w:type="gramEnd"/>
+      <w:r>
+        <w:rPr>
+          <w:rFonts w:ascii="Arial" w:hAnsi="Arial" w:cs="Arial"/>
+          <w:sz w:val="24"/>
+          <w:szCs w:val="24"/>
+        </w:rPr>
+        <w:t xml:space="preserve"> data list to pass to STAN</w:t>
+      </w:r>
+    </w:p>
+    <w:p>
+      <w:pPr>
+        <w:spacing w:after="0"/>
+        <w:rPr>
+          <w:rFonts w:ascii="Arial" w:hAnsi="Arial" w:cs="Arial"/>
+          <w:sz w:val="24"/>
+          <w:szCs w:val="24"/>
+        </w:rPr>
+      </w:pPr>
+      <w:proofErr w:type="spellStart"/>
+      <w:r>
+        <w:rPr>
+          <w:rFonts w:ascii="Arial" w:hAnsi="Arial" w:cs="Arial"/>
+          <w:sz w:val="24"/>
+          <w:szCs w:val="24"/>
+        </w:rPr>
+        <w:t>data_list</w:t>
+      </w:r>
+      <w:proofErr w:type="spellEnd"/>
+      <w:r>
+        <w:rPr>
+          <w:rFonts w:ascii="Arial" w:hAnsi="Arial" w:cs="Arial"/>
+          <w:sz w:val="24"/>
+          <w:szCs w:val="24"/>
+        </w:rPr>
+        <w:t xml:space="preserve"> &lt;- </w:t>
+      </w:r>
+      <w:proofErr w:type="gramStart"/>
+      <w:r>
+        <w:rPr>
+          <w:rFonts w:ascii="Arial" w:hAnsi="Arial" w:cs="Arial"/>
+          <w:sz w:val="24"/>
+          <w:szCs w:val="24"/>
+        </w:rPr>
+        <w:t>list(</w:t>
+      </w:r>
+      <w:proofErr w:type="gramEnd"/>
     </w:p>
     <w:p>
       <w:pPr>
@@ -10771,44 +11871,108 @@
           <w:sz w:val="24"/>
           <w:szCs w:val="24"/>
         </w:rPr>
-        <w:t xml:space="preserve">  prior_mean = m,</w:t>
-      </w:r>
-    </w:p>
-    <w:p>
-      <w:pPr>
-        <w:spacing w:after="0"/>
-        <w:rPr>
-          <w:rFonts w:ascii="Arial" w:hAnsi="Arial" w:cs="Arial"/>
-          <w:sz w:val="24"/>
-          <w:szCs w:val="24"/>
-        </w:rPr>
-      </w:pPr>
-      <w:r>
-        <w:rPr>
-          <w:rFonts w:ascii="Arial" w:hAnsi="Arial" w:cs="Arial"/>
-          <w:sz w:val="24"/>
-          <w:szCs w:val="24"/>
-        </w:rPr>
-        <w:t xml:space="preserve">  prior_sd = s,</w:t>
-      </w:r>
-    </w:p>
-    <w:p>
-      <w:pPr>
-        <w:spacing w:after="0"/>
-        <w:rPr>
-          <w:rFonts w:ascii="Arial" w:hAnsi="Arial" w:cs="Arial"/>
-          <w:sz w:val="24"/>
-          <w:szCs w:val="24"/>
-        </w:rPr>
-      </w:pPr>
-      <w:r>
-        <w:rPr>
-          <w:rFonts w:ascii="Arial" w:hAnsi="Arial" w:cs="Arial"/>
-          <w:sz w:val="24"/>
-          <w:szCs w:val="24"/>
-        </w:rPr>
-        <w:t xml:space="preserve">  sigma_prior_sd = sigma_sd</w:t>
-      </w:r>
+        <w:t xml:space="preserve">  </w:t>
+      </w:r>
+      <w:proofErr w:type="spellStart"/>
+      <w:r>
+        <w:rPr>
+          <w:rFonts w:ascii="Arial" w:hAnsi="Arial" w:cs="Arial"/>
+          <w:sz w:val="24"/>
+          <w:szCs w:val="24"/>
+        </w:rPr>
+        <w:t>prior_mean</w:t>
+      </w:r>
+      <w:proofErr w:type="spellEnd"/>
+      <w:r>
+        <w:rPr>
+          <w:rFonts w:ascii="Arial" w:hAnsi="Arial" w:cs="Arial"/>
+          <w:sz w:val="24"/>
+          <w:szCs w:val="24"/>
+        </w:rPr>
+        <w:t xml:space="preserve"> = m,</w:t>
+      </w:r>
+    </w:p>
+    <w:p>
+      <w:pPr>
+        <w:spacing w:after="0"/>
+        <w:rPr>
+          <w:rFonts w:ascii="Arial" w:hAnsi="Arial" w:cs="Arial"/>
+          <w:sz w:val="24"/>
+          <w:szCs w:val="24"/>
+        </w:rPr>
+      </w:pPr>
+      <w:r>
+        <w:rPr>
+          <w:rFonts w:ascii="Arial" w:hAnsi="Arial" w:cs="Arial"/>
+          <w:sz w:val="24"/>
+          <w:szCs w:val="24"/>
+        </w:rPr>
+        <w:t xml:space="preserve">  </w:t>
+      </w:r>
+      <w:proofErr w:type="spellStart"/>
+      <w:r>
+        <w:rPr>
+          <w:rFonts w:ascii="Arial" w:hAnsi="Arial" w:cs="Arial"/>
+          <w:sz w:val="24"/>
+          <w:szCs w:val="24"/>
+        </w:rPr>
+        <w:t>prior_sd</w:t>
+      </w:r>
+      <w:proofErr w:type="spellEnd"/>
+      <w:r>
+        <w:rPr>
+          <w:rFonts w:ascii="Arial" w:hAnsi="Arial" w:cs="Arial"/>
+          <w:sz w:val="24"/>
+          <w:szCs w:val="24"/>
+        </w:rPr>
+        <w:t xml:space="preserve"> = s,</w:t>
+      </w:r>
+    </w:p>
+    <w:p>
+      <w:pPr>
+        <w:spacing w:after="0"/>
+        <w:rPr>
+          <w:rFonts w:ascii="Arial" w:hAnsi="Arial" w:cs="Arial"/>
+          <w:sz w:val="24"/>
+          <w:szCs w:val="24"/>
+        </w:rPr>
+      </w:pPr>
+      <w:r>
+        <w:rPr>
+          <w:rFonts w:ascii="Arial" w:hAnsi="Arial" w:cs="Arial"/>
+          <w:sz w:val="24"/>
+          <w:szCs w:val="24"/>
+        </w:rPr>
+        <w:t xml:space="preserve">  </w:t>
+      </w:r>
+      <w:proofErr w:type="spellStart"/>
+      <w:r>
+        <w:rPr>
+          <w:rFonts w:ascii="Arial" w:hAnsi="Arial" w:cs="Arial"/>
+          <w:sz w:val="24"/>
+          <w:szCs w:val="24"/>
+        </w:rPr>
+        <w:t>sigma_prior_sd</w:t>
+      </w:r>
+      <w:proofErr w:type="spellEnd"/>
+      <w:r>
+        <w:rPr>
+          <w:rFonts w:ascii="Arial" w:hAnsi="Arial" w:cs="Arial"/>
+          <w:sz w:val="24"/>
+          <w:szCs w:val="24"/>
+        </w:rPr>
+        <w:t xml:space="preserve"> = </w:t>
+      </w:r>
+      <w:proofErr w:type="spellStart"/>
+      <w:r>
+        <w:rPr>
+          <w:rFonts w:ascii="Arial" w:hAnsi="Arial" w:cs="Arial"/>
+          <w:sz w:val="24"/>
+          <w:szCs w:val="24"/>
+        </w:rPr>
+        <w:t>sigma_sd</w:t>
+      </w:r>
+      <w:proofErr w:type="spellEnd"/>
     </w:p>
     <w:p>
       <w:pPr>
@@ -10871,25 +12035,71 @@
           <w:sz w:val="24"/>
           <w:szCs w:val="24"/>
         </w:rPr>
-        <w:t>fit &lt;- mod$sample(</w:t>
-      </w:r>
-    </w:p>
-    <w:p>
-      <w:pPr>
-        <w:spacing w:after="0"/>
-        <w:rPr>
-          <w:rFonts w:ascii="Arial" w:hAnsi="Arial" w:cs="Arial"/>
-          <w:sz w:val="24"/>
-          <w:szCs w:val="24"/>
-        </w:rPr>
-      </w:pPr>
-      <w:r>
-        <w:rPr>
-          <w:rFonts w:ascii="Arial" w:hAnsi="Arial" w:cs="Arial"/>
-          <w:sz w:val="24"/>
-          <w:szCs w:val="24"/>
-        </w:rPr>
-        <w:t xml:space="preserve">  data = data_list,</w:t>
+        <w:t xml:space="preserve">fit &lt;- </w:t>
+      </w:r>
+      <w:proofErr w:type="spellStart"/>
+      <w:r>
+        <w:rPr>
+          <w:rFonts w:ascii="Arial" w:hAnsi="Arial" w:cs="Arial"/>
+          <w:sz w:val="24"/>
+          <w:szCs w:val="24"/>
+        </w:rPr>
+        <w:t>mod$</w:t>
+      </w:r>
+      <w:proofErr w:type="gramStart"/>
+      <w:r>
+        <w:rPr>
+          <w:rFonts w:ascii="Arial" w:hAnsi="Arial" w:cs="Arial"/>
+          <w:sz w:val="24"/>
+          <w:szCs w:val="24"/>
+        </w:rPr>
+        <w:t>sample</w:t>
+      </w:r>
+      <w:proofErr w:type="spellEnd"/>
+      <w:r>
+        <w:rPr>
+          <w:rFonts w:ascii="Arial" w:hAnsi="Arial" w:cs="Arial"/>
+          <w:sz w:val="24"/>
+          <w:szCs w:val="24"/>
+        </w:rPr>
+        <w:t>(</w:t>
+      </w:r>
+      <w:proofErr w:type="gramEnd"/>
+    </w:p>
+    <w:p>
+      <w:pPr>
+        <w:spacing w:after="0"/>
+        <w:rPr>
+          <w:rFonts w:ascii="Arial" w:hAnsi="Arial" w:cs="Arial"/>
+          <w:sz w:val="24"/>
+          <w:szCs w:val="24"/>
+        </w:rPr>
+      </w:pPr>
+      <w:r>
+        <w:rPr>
+          <w:rFonts w:ascii="Arial" w:hAnsi="Arial" w:cs="Arial"/>
+          <w:sz w:val="24"/>
+          <w:szCs w:val="24"/>
+        </w:rPr>
+        <w:t xml:space="preserve">  data = </w:t>
+      </w:r>
+      <w:proofErr w:type="spellStart"/>
+      <w:r>
+        <w:rPr>
+          <w:rFonts w:ascii="Arial" w:hAnsi="Arial" w:cs="Arial"/>
+          <w:sz w:val="24"/>
+          <w:szCs w:val="24"/>
+        </w:rPr>
+        <w:t>data_list</w:t>
+      </w:r>
+      <w:proofErr w:type="spellEnd"/>
+      <w:r>
+        <w:rPr>
+          <w:rFonts w:ascii="Arial" w:hAnsi="Arial" w:cs="Arial"/>
+          <w:sz w:val="24"/>
+          <w:szCs w:val="24"/>
+        </w:rPr>
+        <w:t>,</w:t>
       </w:r>
     </w:p>
     <w:p>
@@ -10925,25 +12135,61 @@
           <w:sz w:val="24"/>
           <w:szCs w:val="24"/>
         </w:rPr>
-        <w:t xml:space="preserve">  iter_warmup = 2000,</w:t>
-      </w:r>
-    </w:p>
-    <w:p>
-      <w:pPr>
-        <w:spacing w:after="0"/>
-        <w:rPr>
-          <w:rFonts w:ascii="Arial" w:hAnsi="Arial" w:cs="Arial"/>
-          <w:sz w:val="24"/>
-          <w:szCs w:val="24"/>
-        </w:rPr>
-      </w:pPr>
-      <w:r>
-        <w:rPr>
-          <w:rFonts w:ascii="Arial" w:hAnsi="Arial" w:cs="Arial"/>
-          <w:sz w:val="24"/>
-          <w:szCs w:val="24"/>
-        </w:rPr>
-        <w:t xml:space="preserve">  iter_sampling = 10000,</w:t>
+        <w:t xml:space="preserve">  </w:t>
+      </w:r>
+      <w:proofErr w:type="spellStart"/>
+      <w:r>
+        <w:rPr>
+          <w:rFonts w:ascii="Arial" w:hAnsi="Arial" w:cs="Arial"/>
+          <w:sz w:val="24"/>
+          <w:szCs w:val="24"/>
+        </w:rPr>
+        <w:t>iter_warmup</w:t>
+      </w:r>
+      <w:proofErr w:type="spellEnd"/>
+      <w:r>
+        <w:rPr>
+          <w:rFonts w:ascii="Arial" w:hAnsi="Arial" w:cs="Arial"/>
+          <w:sz w:val="24"/>
+          <w:szCs w:val="24"/>
+        </w:rPr>
+        <w:t xml:space="preserve"> = 2000,</w:t>
+      </w:r>
+    </w:p>
+    <w:p>
+      <w:pPr>
+        <w:spacing w:after="0"/>
+        <w:rPr>
+          <w:rFonts w:ascii="Arial" w:hAnsi="Arial" w:cs="Arial"/>
+          <w:sz w:val="24"/>
+          <w:szCs w:val="24"/>
+        </w:rPr>
+      </w:pPr>
+      <w:r>
+        <w:rPr>
+          <w:rFonts w:ascii="Arial" w:hAnsi="Arial" w:cs="Arial"/>
+          <w:sz w:val="24"/>
+          <w:szCs w:val="24"/>
+        </w:rPr>
+        <w:t xml:space="preserve">  </w:t>
+      </w:r>
+      <w:proofErr w:type="spellStart"/>
+      <w:r>
+        <w:rPr>
+          <w:rFonts w:ascii="Arial" w:hAnsi="Arial" w:cs="Arial"/>
+          <w:sz w:val="24"/>
+          <w:szCs w:val="24"/>
+        </w:rPr>
+        <w:t>iter_sampling</w:t>
+      </w:r>
+      <w:proofErr w:type="spellEnd"/>
+      <w:r>
+        <w:rPr>
+          <w:rFonts w:ascii="Arial" w:hAnsi="Arial" w:cs="Arial"/>
+          <w:sz w:val="24"/>
+          <w:szCs w:val="24"/>
+        </w:rPr>
+        <w:t xml:space="preserve"> = 10000,</w:t>
       </w:r>
     </w:p>
     <w:p>
@@ -12322,7 +13568,6 @@
   <w:style w:type="character" w:default="1" w:styleId="DefaultParagraphFont">
     <w:name w:val="Default Paragraph Font"/>
     <w:uiPriority w:val="1"/>
-    <w:semiHidden/>
     <w:unhideWhenUsed/>
   </w:style>
   <w:style w:type="table" w:default="1" w:styleId="TableNormal">
@@ -12794,6 +14039,7 @@
     <w:rsid w:val="00721031"/>
     <w:rsid w:val="008153A8"/>
     <w:rsid w:val="00951739"/>
+    <w:rsid w:val="009F2ABC"/>
     <w:rsid w:val="00AA65C1"/>
     <w:rsid w:val="00AA686D"/>
     <w:rsid w:val="00B8665A"/>

</xml_diff>